<commit_message>
results: fix day count, tidy r2 wording
</commit_message>
<xml_diff>
--- a/paper/Miura_Meng_Affect_Paper_v9.docx
+++ b/paper/Miura_Meng_Affect_Paper_v9.docx
@@ -99,7 +99,7 @@
           <w:sz w:val="24"/>
           <w:szCs w:val="24"/>
         </w:rPr>
-        <w:t>This study applies a control-theoretic framework to the intensive longitudinal self-study of affective dynamics in a single individual. The aim was to characterize how internal self-regulatory variables and an external pharmacological probe each shape daily mood. Over a 70-day protocol, momentary emotional valence, perceived agency, and metacognitive awareness were sampled three times daily via ecological momentary assessment (195 observations, 92.9% compliance). Nightly 3 mg melatonin administration was introduced according to a pre-generated randomized schedule. The pre-specified design yielded 35 control and 35 melatonin daily aggregates. The individual was modeled as a dynamical system; melatonin was treated as a probe to characterize the system’s response, not as a candidate treatment. Time-series methods (autoregressive, state-space, impulse response, heteroskedasticity, and metacontrol interaction analyses) were used to estimate the contributions of internal behavioral drivers and the external probe. Internal drivers (agency and metacognitive awareness) accounted for 51.5% of daily-mood variance over an AR(1) baseline, while melatonin contributed negligibly to mean-level mood (Δ = +0.92 on a 0–100 scale, d = 0.17). A heteroskedasticity analysis suggested smaller residual variance on melatonin days, compatible with melatonin’s chronobiotic function. The metacontrol interaction was direction-consistent but underpowered. This case illustrates how internal self-regulatory variables and an external pharmacological probe contribute differentially to affective dynamics; the probe defined a sensitivity boundary rather than signaling absent effects.</w:t>
+        <w:t>This study applies a control-theoretic framework to the intensive longitudinal self-study of affective dynamics in a single individual. The aim was to characterize how internal self-regulatory variables and an external pharmacological probe each shape daily mood. Over a 70-day protocol, momentary emotional valence, perceived agency, and metacognitive awareness were sampled three times daily via ecological momentary assessment (195 observations, 92.9% compliance). Nightly 3 mg melatonin administration was introduced according to a pre-generated randomized schedule. The pre-specified design yielded 35 control and 35 melatonin daily aggregates. The individual was modeled as a dynamical system; melatonin was treated as a probe to characterize the system’s response, not as a candidate treatment. Time-series methods (autoregressive, state-space, impulse response, heteroskedasticity, and metacontrol interaction analyses) were used to estimate the contributions of internal behavioral drivers and the external probe. Internal drivers (agency and metacognitive awareness) accounted for an additional 51.5% of daily-mood variance beyond autoregressive carryover and the melatonin probe (model R² rising from .125 to .641), while melatonin contributed negligibly to mean-level mood (Δ = +0.92 on a 0–100 scale, d = 0.17). A heteroskedasticity analysis suggested smaller residual variance on melatonin days, compatible with melatonin’s chronobiotic function. The metacontrol interaction was direction-consistent but underpowered. This case illustrates how internal self-regulatory variables and an external pharmacological probe contribute differentially to affective dynamics; the probe defined a sensitivity boundary rather than signaling absent effects.</w:t>
       </w:r>
     </w:p>
     <w:p>
@@ -4070,7 +4070,7 @@
           <w:sz w:val="24"/>
           <w:szCs w:val="24"/>
         </w:rPr>
-        <w:t>The drop-one incremental R² comparison made the magnitudes of these contributions directly comparable (Figure 3). Agency uniquely accounted for 19.7% of the variance in daily mood beyond what the other predictors in M2 captured; metacognition uniquely accounted for 11.0%; melatonin uniquely accounted for 0.01%. The internal-driver block (agency and metacognition jointly) accounted for 51.5% of the variance over and above the AR(1) baseline.</w:t>
+        <w:t>The drop-one incremental R² comparison made the magnitudes of these contributions directly comparable (Figure 3). Agency uniquely accounted for 19.7% of the variance in daily mood beyond what the other predictors in M2 captured; metacognition uniquely accounted for 11.0%; melatonin uniquely accounted for 0.01%. The internal-driver block (agency and metacognition jointly) accounted for 51.5% of the variance beyond the autoregressive-plus-melatonin model (M1), raising R² from .125 (M1) to .641 (M2). Because agency and metacognition are themselves correlated, this joint contribution exceeds the sum of their unique drop-one contributions (19.7% and 11.0%); the difference reflects variance the two share.</w:t>
       </w:r>
     </w:p>
     <w:p>
@@ -7284,7 +7284,7 @@
           <w:sz w:val="24"/>
           <w:szCs w:val="24"/>
         </w:rPr>
-        <w:t xml:space="preserve">Several measurement-level concerns constrain interpretation. Single-item momentary affect measures carry non-trivial measurement error (Dejonckheere et al., 2022), and the Day-18 protocol amendment restricts the data window for analyses involving agency and metacognition to 54 days, limiting statistical power for interaction tests. Mood, agency, and metacognitive awareness were all measured by single-item self-report at the same EMA prompt, while the melatonin indicator was recorded objectively. The three internal variables share an instrument, a reporter, and a response scale that the external probe does not; their covariance therefore carries a common-method component that may inflate the apparent predictive contribution of agency and metacognition. The variance contrast should be read as a comparison that favors the internal drivers on measurement grounds, not as a calibrated estimate across measurement modalities. Thrice-daily monitoring may also have increased the salience of these internal states and thereby their observed predictive contribution (Barta et al., 2012; Conner &amp; Reid, 2012).</w:t>
+        <w:t xml:space="preserve">Several measurement-level concerns constrain interpretation. Single-item momentary affect measures carry non-trivial measurement error (Dejonckheere et al., 2022), and the Day-18 protocol amendment restricts the data window for analyses involving agency and metacognition to 53 days, limiting statistical power for interaction tests. Mood, agency, and metacognitive awareness were all measured by single-item self-report at the same EMA prompt, while the melatonin indicator was recorded objectively. The three internal variables share an instrument, a reporter, and a response scale that the external probe does not; their covariance therefore carries a common-method component that may inflate the apparent predictive contribution of agency and metacognition. The variance contrast should be read as a comparison that favors the internal drivers on measurement grounds, not as a calibrated estimate across measurement modalities. Thrice-daily monitoring may also have increased the salience of these internal states and thereby their observed predictive contribution (Barta et al., 2012; Conner &amp; Reid, 2012).</w:t>
       </w:r>
     </w:p>
     <w:p>

</xml_diff>

<commit_message>
refs: drop uncited, move scope note up
</commit_message>
<xml_diff>
--- a/paper/Miura_Meng_Affect_Paper_v9.docx
+++ b/paper/Miura_Meng_Affect_Paper_v9.docx
@@ -341,7 +341,7 @@
           <w:sz w:val="24"/>
           <w:szCs w:val="24"/>
         </w:rPr>
-        <w:t>This reframing carries a methodological consequence: a non-significant intervention effect is not a design failure. The conventional reading, that the design lacks power to reject the null, presupposes a hypothesis-testing framework in which the intervention is a treatment whose efficacy is being assayed. The present study does not adopt that framework. Within the control-theoretic framing, the evidential question is not whether the intervention coefficient differs from zero in absolute terms, but how its contribution to the system’s variance compares to the contributions of endogenous drivers, and whether its effect manifests in features of the trajectory other than the mean. A well-characterized null in this framing identifies the system’s sensitivity boundary; it does not signal an absence of evidence.</w:t>
+        <w:t>This reframing carries a methodological consequence: a non-significant intervention effect is not a design failure. The conventional reading, that the design lacks power to reject the null, presupposes a hypothesis-testing framework in which the intervention is a treatment whose efficacy is being assayed. The present study does not adopt that framework. Within the control-theoretic framing, the evidential question is not whether the intervention coefficient differs from zero in absolute terms, but how its contribution to the system’s variance compares to the contributions of endogenous drivers, and whether its effect manifests in features of the trajectory other than the mean. A well-characterized null in this framing identifies the system’s sensitivity boundary; it does not signal an absence of evidence. The control-theoretic vocabulary used throughout (perturbation, probe, sensitivity boundary, system identification) is intended in an analytic and conceptual sense, as a way of organizing dynamical questions about a single person across time; it is not a claim that the present analyses estimate engineering transfer functions or recover a closed-form physical plant model.</w:t>
       </w:r>
     </w:p>
     <w:p>
@@ -7370,7 +7370,7 @@
           <w:sz w:val="24"/>
           <w:szCs w:val="24"/>
         </w:rPr>
-        <w:t xml:space="preserve">First, methodologically, it demonstrates the application of control-theoretic methods (system identification, impulse response analysis, state-space modeling, and conditional heteroskedasticity modeling) to the intensive longitudinal self-study of affect in a single individual. The pipeline (iOS Shortcuts automation, Python validation, pre-registered randomization schedule, open analysis code) is offered as a template for personal-science research that aims to go beyond descriptive single-case reporting toward formal system characterization. The control-theoretic terminology used here (perturbation, sensitivity boundary, system identification) is intended in an analytic and conceptual sense, as a vocabulary for organizing dynamical questions about a single person across time; it is not a claim that the present analyses estimate engineering transfer functions or recover a closed-form physical plant model.</w:t>
+        <w:t xml:space="preserve">First, methodologically, it demonstrates the application of control-theoretic methods (system identification, impulse response analysis, state-space modeling, and conditional heteroskedasticity modeling) to the intensive longitudinal self-study of affect in a single individual. The pipeline (iOS Shortcuts automation, Python validation, pre-registered randomization schedule, open analysis code) is offered as a template for personal-science research that aims to go beyond descriptive single-case reporting toward formal system characterization.</w:t>
       </w:r>
     </w:p>
     <w:p>
@@ -7624,7 +7624,7 @@
           <w:sz w:val="24"/>
           <w:szCs w:val="24"/>
         </w:rPr>
-        <w:t xml:space="preserve">Archer, M. S. (2003). </w:t>
+        <w:t xml:space="preserve">Bandura, A. (1989). Human agency in social cognitive theory. </w:t>
       </w:r>
       <w:r>
         <w:rPr>
@@ -7634,29 +7634,39 @@
           <w:sz w:val="24"/>
           <w:szCs w:val="24"/>
         </w:rPr>
-        <w:t xml:space="preserve">Structure, agency, and the internal conversation</w:t>
-      </w:r>
-      <w:r>
-        <w:rPr>
-          <w:rFonts w:ascii="Times New Roman" w:cs="Times New Roman" w:eastAsia="Times New Roman" w:hAnsi="Times New Roman"/>
-          <w:sz w:val="24"/>
-          <w:szCs w:val="24"/>
-        </w:rPr>
-        <w:t xml:space="preserve">. Cambridge University Press.</w:t>
-      </w:r>
-    </w:p>
-    <w:p>
-      <w:pPr>
-        <w:spacing w:after="120" w:before="0" w:line="480"/>
-        <w:ind w:left="720" w:hanging="720"/>
-      </w:pPr>
-      <w:r>
-        <w:rPr>
-          <w:rFonts w:ascii="Times New Roman" w:cs="Times New Roman" w:eastAsia="Times New Roman" w:hAnsi="Times New Roman"/>
-          <w:sz w:val="24"/>
-          <w:szCs w:val="24"/>
-        </w:rPr>
-        <w:t xml:space="preserve">Bandura, A. (1989). Human agency in social cognitive theory. </w:t>
+        <w:t xml:space="preserve">American Psychologist, 44</w:t>
+      </w:r>
+      <w:r>
+        <w:rPr>
+          <w:rFonts w:ascii="Times New Roman" w:cs="Times New Roman" w:eastAsia="Times New Roman" w:hAnsi="Times New Roman"/>
+          <w:sz w:val="24"/>
+          <w:szCs w:val="24"/>
+        </w:rPr>
+        <w:t xml:space="preserve">(9), 1175–1184.</w:t>
+      </w:r>
+      <w:r>
+        <w:rPr>
+          <w:rFonts w:ascii="Times New Roman" w:cs="Times New Roman" w:eastAsia="Times New Roman" w:hAnsi="Times New Roman"/>
+          <w:color w:val="1A56DB"/>
+          <w:sz w:val="24"/>
+          <w:szCs w:val="24"/>
+          <w:u w:val="single"/>
+        </w:rPr>
+        <w:t xml:space="preserve"> https://doi.org/10.1037/0003-066X.44.9.1175</w:t>
+      </w:r>
+    </w:p>
+    <w:p>
+      <w:pPr>
+        <w:spacing w:after="120" w:before="0" w:line="480"/>
+        <w:ind w:hanging="720" w:left="720"/>
+      </w:pPr>
+      <w:r>
+        <w:rPr>
+          <w:rFonts w:ascii="Times New Roman" w:cs="Times New Roman" w:eastAsia="Times New Roman" w:hAnsi="Times New Roman"/>
+          <w:sz w:val="24"/>
+          <w:szCs w:val="24"/>
+        </w:rPr>
+        <w:t xml:space="preserve">Bandura, A. (2001). Social cognitive theory: An agentic perspective. </w:t>
       </w:r>
       <w:r>
         <w:rPr>
@@ -7666,15 +7676,15 @@
           <w:sz w:val="24"/>
           <w:szCs w:val="24"/>
         </w:rPr>
-        <w:t xml:space="preserve">American Psychologist, 44</w:t>
-      </w:r>
-      <w:r>
-        <w:rPr>
-          <w:rFonts w:ascii="Times New Roman" w:cs="Times New Roman" w:eastAsia="Times New Roman" w:hAnsi="Times New Roman"/>
-          <w:sz w:val="24"/>
-          <w:szCs w:val="24"/>
-        </w:rPr>
-        <w:t xml:space="preserve">(9), 1175–1184.</w:t>
+        <w:t xml:space="preserve">Annual Review of Psychology, 52</w:t>
+      </w:r>
+      <w:r>
+        <w:rPr>
+          <w:rFonts w:ascii="Times New Roman" w:cs="Times New Roman" w:eastAsia="Times New Roman" w:hAnsi="Times New Roman"/>
+          <w:sz w:val="24"/>
+          <w:szCs w:val="24"/>
+        </w:rPr>
+        <w:t xml:space="preserve">, 1–26.</w:t>
       </w:r>
       <w:r>
         <w:rPr>
@@ -7684,21 +7694,21 @@
           <w:szCs w:val="24"/>
           <w:u w:val="single"/>
         </w:rPr>
-        <w:t xml:space="preserve"> https://doi.org/10.1037/0003-066X.44.9.1175</w:t>
-      </w:r>
-    </w:p>
-    <w:p>
-      <w:pPr>
-        <w:spacing w:after="120" w:before="0" w:line="480"/>
-        <w:ind w:hanging="720" w:left="720"/>
-      </w:pPr>
-      <w:r>
-        <w:rPr>
-          <w:rFonts w:ascii="Times New Roman" w:cs="Times New Roman" w:eastAsia="Times New Roman" w:hAnsi="Times New Roman"/>
-          <w:sz w:val="24"/>
-          <w:szCs w:val="24"/>
-        </w:rPr>
-        <w:t xml:space="preserve">Bandura, A. (2001). Social cognitive theory: An agentic perspective. </w:t>
+        <w:t xml:space="preserve"> https://doi.org/10.1146/annurev.psych.52.1.1</w:t>
+      </w:r>
+    </w:p>
+    <w:p>
+      <w:pPr>
+        <w:spacing w:after="120" w:before="0" w:line="480"/>
+        <w:ind w:left="720" w:hanging="720"/>
+      </w:pPr>
+      <w:r>
+        <w:rPr>
+          <w:rFonts w:ascii="Times New Roman" w:cs="Times New Roman" w:eastAsia="Times New Roman" w:hAnsi="Times New Roman"/>
+          <w:sz w:val="24"/>
+          <w:szCs w:val="24"/>
+        </w:rPr>
+        <w:t xml:space="preserve">Bandura, A. (2006). Toward a psychology of human agency. </w:t>
       </w:r>
       <w:r>
         <w:rPr>
@@ -7708,15 +7718,15 @@
           <w:sz w:val="24"/>
           <w:szCs w:val="24"/>
         </w:rPr>
-        <w:t xml:space="preserve">Annual Review of Psychology, 52</w:t>
-      </w:r>
-      <w:r>
-        <w:rPr>
-          <w:rFonts w:ascii="Times New Roman" w:cs="Times New Roman" w:eastAsia="Times New Roman" w:hAnsi="Times New Roman"/>
-          <w:sz w:val="24"/>
-          <w:szCs w:val="24"/>
-        </w:rPr>
-        <w:t xml:space="preserve">, 1–26.</w:t>
+        <w:t xml:space="preserve">Perspectives on Psychological Science, 1</w:t>
+      </w:r>
+      <w:r>
+        <w:rPr>
+          <w:rFonts w:ascii="Times New Roman" w:cs="Times New Roman" w:eastAsia="Times New Roman" w:hAnsi="Times New Roman"/>
+          <w:sz w:val="24"/>
+          <w:szCs w:val="24"/>
+        </w:rPr>
+        <w:t xml:space="preserve">(2), 164–180.</w:t>
       </w:r>
       <w:r>
         <w:rPr>
@@ -7726,7 +7736,7 @@
           <w:szCs w:val="24"/>
           <w:u w:val="single"/>
         </w:rPr>
-        <w:t xml:space="preserve"> https://doi.org/10.1146/annurev.psych.52.1.1</w:t>
+        <w:t xml:space="preserve"> https://doi.org/10.1111/j.1745-6916.2006.00011.x</w:t>
       </w:r>
     </w:p>
     <w:p>
@@ -7740,7 +7750,7 @@
           <w:sz w:val="24"/>
           <w:szCs w:val="24"/>
         </w:rPr>
-        <w:t xml:space="preserve">Bandura, A. (2006). Toward a psychology of human agency. </w:t>
+        <w:t xml:space="preserve">Barta, W. D., Tennen, H., &amp; Litt, M. D. (2012). Measurement reactivity in diary research. In M. R. Mehl &amp; T. S. Conner (Eds.), </w:t>
       </w:r>
       <w:r>
         <w:rPr>
@@ -7750,39 +7760,29 @@
           <w:sz w:val="24"/>
           <w:szCs w:val="24"/>
         </w:rPr>
-        <w:t xml:space="preserve">Perspectives on Psychological Science, 1</w:t>
-      </w:r>
-      <w:r>
-        <w:rPr>
-          <w:rFonts w:ascii="Times New Roman" w:cs="Times New Roman" w:eastAsia="Times New Roman" w:hAnsi="Times New Roman"/>
-          <w:sz w:val="24"/>
-          <w:szCs w:val="24"/>
-        </w:rPr>
-        <w:t xml:space="preserve">(2), 164–180.</w:t>
-      </w:r>
-      <w:r>
-        <w:rPr>
-          <w:rFonts w:ascii="Times New Roman" w:cs="Times New Roman" w:eastAsia="Times New Roman" w:hAnsi="Times New Roman"/>
-          <w:color w:val="1A56DB"/>
-          <w:sz w:val="24"/>
-          <w:szCs w:val="24"/>
-          <w:u w:val="single"/>
-        </w:rPr>
-        <w:t xml:space="preserve"> https://doi.org/10.1111/j.1745-6916.2006.00011.x</w:t>
-      </w:r>
-    </w:p>
-    <w:p>
-      <w:pPr>
-        <w:spacing w:after="120" w:before="0" w:line="480"/>
-        <w:ind w:left="720" w:hanging="720"/>
-      </w:pPr>
-      <w:r>
-        <w:rPr>
-          <w:rFonts w:ascii="Times New Roman" w:cs="Times New Roman" w:eastAsia="Times New Roman" w:hAnsi="Times New Roman"/>
-          <w:sz w:val="24"/>
-          <w:szCs w:val="24"/>
-        </w:rPr>
-        <w:t xml:space="preserve">Barta, W. D., Tennen, H., &amp; Litt, M. D. (2012). Measurement reactivity in diary research. In M. R. Mehl &amp; T. S. Conner (Eds.), </w:t>
+        <w:t xml:space="preserve">Handbook of research methods for studying daily life</w:t>
+      </w:r>
+      <w:r>
+        <w:rPr>
+          <w:rFonts w:ascii="Times New Roman" w:cs="Times New Roman" w:eastAsia="Times New Roman" w:hAnsi="Times New Roman"/>
+          <w:sz w:val="24"/>
+          <w:szCs w:val="24"/>
+        </w:rPr>
+        <w:t xml:space="preserve"> (pp. 108–123). Guilford Press.</w:t>
+      </w:r>
+    </w:p>
+    <w:p>
+      <w:pPr>
+        <w:spacing w:after="120" w:before="0" w:line="480"/>
+        <w:jc w:val="both"/>
+      </w:pPr>
+      <w:r>
+        <w:rPr>
+          <w:rFonts w:ascii="Times New Roman" w:cs="Times New Roman" w:eastAsia="Times New Roman" w:hAnsi="Times New Roman"/>
+          <w:sz w:val="24"/>
+          <w:szCs w:val="24"/>
+        </w:rPr>
+        <w:t xml:space="preserve">Bates, D., Mächler, M., Bolker, B., &amp; Walker, S. (2015). Fitting linear mixed-effects models using lme4. </w:t>
       </w:r>
       <w:r>
         <w:rPr>
@@ -7792,29 +7792,29 @@
           <w:sz w:val="24"/>
           <w:szCs w:val="24"/>
         </w:rPr>
-        <w:t xml:space="preserve">Handbook of research methods for studying daily life</w:t>
-      </w:r>
-      <w:r>
-        <w:rPr>
-          <w:rFonts w:ascii="Times New Roman" w:cs="Times New Roman" w:eastAsia="Times New Roman" w:hAnsi="Times New Roman"/>
-          <w:sz w:val="24"/>
-          <w:szCs w:val="24"/>
-        </w:rPr>
-        <w:t xml:space="preserve"> (pp. 108–123). Guilford Press.</w:t>
-      </w:r>
-    </w:p>
-    <w:p>
-      <w:pPr>
-        <w:spacing w:after="120" w:before="0" w:line="480"/>
-        <w:jc w:val="both"/>
-      </w:pPr>
-      <w:r>
-        <w:rPr>
-          <w:rFonts w:ascii="Times New Roman" w:cs="Times New Roman" w:eastAsia="Times New Roman" w:hAnsi="Times New Roman"/>
-          <w:sz w:val="24"/>
-          <w:szCs w:val="24"/>
-        </w:rPr>
-        <w:t xml:space="preserve">Bates, D., Mächler, M., Bolker, B., &amp; Walker, S. (2015). Fitting linear mixed-effects models using lme4. </w:t>
+        <w:t xml:space="preserve">Journal of Statistical Software, 67</w:t>
+      </w:r>
+      <w:r>
+        <w:rPr>
+          <w:rFonts w:ascii="Times New Roman" w:cs="Times New Roman" w:eastAsia="Times New Roman" w:hAnsi="Times New Roman"/>
+          <w:sz w:val="24"/>
+          <w:szCs w:val="24"/>
+        </w:rPr>
+        <w:t xml:space="preserve">(1), 1–48. https://doi.org/10.18637/jss.v067.i01</w:t>
+      </w:r>
+    </w:p>
+    <w:p>
+      <w:pPr>
+        <w:spacing w:after="120" w:before="0" w:line="480"/>
+        <w:ind w:left="720" w:hanging="720"/>
+      </w:pPr>
+      <w:r>
+        <w:rPr>
+          <w:rFonts w:ascii="Times New Roman" w:cs="Times New Roman" w:eastAsia="Times New Roman" w:hAnsi="Times New Roman"/>
+          <w:sz w:val="24"/>
+          <w:szCs w:val="24"/>
+        </w:rPr>
+        <w:t xml:space="preserve">Bringmann, L. F., Vissers, N., Wichers, M., Geschwind, N., Kuppens, P., Peeters, F., Borsboom, D., &amp; Tuerlinckx, F. (2013). A network approach to psychopathology: New insights into clinical longitudinal data. </w:t>
       </w:r>
       <w:r>
         <w:rPr>
@@ -7824,29 +7824,53 @@
           <w:sz w:val="24"/>
           <w:szCs w:val="24"/>
         </w:rPr>
-        <w:t xml:space="preserve">Journal of Statistical Software, 67</w:t>
-      </w:r>
-      <w:r>
-        <w:rPr>
-          <w:rFonts w:ascii="Times New Roman" w:cs="Times New Roman" w:eastAsia="Times New Roman" w:hAnsi="Times New Roman"/>
-          <w:sz w:val="24"/>
-          <w:szCs w:val="24"/>
-        </w:rPr>
-        <w:t xml:space="preserve">(1), 1–48. https://doi.org/10.18637/jss.v067.i01</w:t>
-      </w:r>
-    </w:p>
-    <w:p>
-      <w:pPr>
-        <w:spacing w:after="120" w:before="0" w:line="480"/>
-        <w:ind w:hanging="720" w:left="720"/>
-      </w:pPr>
-      <w:r>
-        <w:rPr>
-          <w:rFonts w:ascii="Times New Roman" w:cs="Times New Roman" w:eastAsia="Times New Roman" w:hAnsi="Times New Roman"/>
-          <w:sz w:val="24"/>
-          <w:szCs w:val="24"/>
-        </w:rPr>
-        <w:t xml:space="preserve">Bourdieu, P. (1990). </w:t>
+        <w:t xml:space="preserve">PLoS ONE, 8</w:t>
+      </w:r>
+      <w:r>
+        <w:rPr>
+          <w:rFonts w:ascii="Times New Roman" w:cs="Times New Roman" w:eastAsia="Times New Roman" w:hAnsi="Times New Roman"/>
+          <w:sz w:val="24"/>
+          <w:szCs w:val="24"/>
+        </w:rPr>
+        <w:t xml:space="preserve">(4), e60188.</w:t>
+      </w:r>
+      <w:r>
+        <w:rPr>
+          <w:rFonts w:ascii="Times New Roman" w:cs="Times New Roman" w:eastAsia="Times New Roman" w:hAnsi="Times New Roman"/>
+          <w:color w:val="1A56DB"/>
+          <w:sz w:val="24"/>
+          <w:szCs w:val="24"/>
+          <w:u w:val="single"/>
+        </w:rPr>
+        <w:t xml:space="preserve"> https://doi.org/10.1371/journal.pone.0060188</w:t>
+      </w:r>
+    </w:p>
+    <w:p>
+      <w:pPr>
+        <w:spacing w:after="120" w:before="0" w:line="480"/>
+        <w:ind w:left="720" w:hanging="720"/>
+      </w:pPr>
+      <w:r>
+        <w:rPr>
+          <w:rFonts w:ascii="Times New Roman" w:cs="Times New Roman" w:eastAsia="Times New Roman" w:hAnsi="Times New Roman"/>
+          <w:sz w:val="24"/>
+          <w:szCs w:val="24"/>
+        </w:rPr>
+        <w:t xml:space="preserve">Bringmann, L. F., Albers, C., Bockting, C., Borsboom, D., Ceulemans, E., Cramer, A. O. J., ... &amp; Wichers, M. (2022). Psychopathological networks: Theory, methods and practice. Behaviour Research and Therapy, 149, 104011. https://doi.org/10.1016/j.brat.2021.104011</w:t>
+      </w:r>
+    </w:p>
+    <w:p>
+      <w:pPr>
+        <w:spacing w:after="120" w:before="0" w:line="480"/>
+        <w:ind w:left="720" w:hanging="720"/>
+      </w:pPr>
+      <w:r>
+        <w:rPr>
+          <w:rFonts w:ascii="Times New Roman" w:cs="Times New Roman" w:eastAsia="Times New Roman" w:hAnsi="Times New Roman"/>
+          <w:sz w:val="24"/>
+          <w:szCs w:val="24"/>
+        </w:rPr>
+        <w:t xml:space="preserve">Bürkner, P.-C. (2017). brms: An R package for Bayesian multilevel models using Stan. </w:t>
       </w:r>
       <w:r>
         <w:rPr>
@@ -7856,15 +7880,25 @@
           <w:sz w:val="24"/>
           <w:szCs w:val="24"/>
         </w:rPr>
-        <w:t xml:space="preserve">The logic of practice</w:t>
-      </w:r>
-      <w:r>
-        <w:rPr>
-          <w:rFonts w:ascii="Times New Roman" w:cs="Times New Roman" w:eastAsia="Times New Roman" w:hAnsi="Times New Roman"/>
-          <w:sz w:val="24"/>
-          <w:szCs w:val="24"/>
-        </w:rPr>
-        <w:t xml:space="preserve"> (R. Nice, Trans.). Stanford University Press. (Original work published 1980)</w:t>
+        <w:t xml:space="preserve">Journal of Statistical Software, 80</w:t>
+      </w:r>
+      <w:r>
+        <w:rPr>
+          <w:rFonts w:ascii="Times New Roman" w:cs="Times New Roman" w:eastAsia="Times New Roman" w:hAnsi="Times New Roman"/>
+          <w:sz w:val="24"/>
+          <w:szCs w:val="24"/>
+        </w:rPr>
+        <w:t xml:space="preserve">(1), 1–28.</w:t>
+      </w:r>
+      <w:r>
+        <w:rPr>
+          <w:rFonts w:ascii="Times New Roman" w:cs="Times New Roman" w:eastAsia="Times New Roman" w:hAnsi="Times New Roman"/>
+          <w:color w:val="1A56DB"/>
+          <w:sz w:val="24"/>
+          <w:szCs w:val="24"/>
+          <w:u w:val="single"/>
+        </w:rPr>
+        <w:t xml:space="preserve"> https://doi.org/10.18637/jss.v080.i01</w:t>
       </w:r>
     </w:p>
     <w:p>
@@ -7878,7 +7912,7 @@
           <w:sz w:val="24"/>
           <w:szCs w:val="24"/>
         </w:rPr>
-        <w:t xml:space="preserve">Bringmann, L. F., Vissers, N., Wichers, M., Geschwind, N., Kuppens, P., Peeters, F., Borsboom, D., &amp; Tuerlinckx, F. (2013). A network approach to psychopathology: New insights into clinical longitudinal data. </w:t>
+        <w:t xml:space="preserve">Carver, C. S., &amp; Scheier, M. F. (1990). Origins and functions of positive and negative affect: A control-process view. </w:t>
       </w:r>
       <w:r>
         <w:rPr>
@@ -7888,15 +7922,15 @@
           <w:sz w:val="24"/>
           <w:szCs w:val="24"/>
         </w:rPr>
-        <w:t xml:space="preserve">PLoS ONE, 8</w:t>
-      </w:r>
-      <w:r>
-        <w:rPr>
-          <w:rFonts w:ascii="Times New Roman" w:cs="Times New Roman" w:eastAsia="Times New Roman" w:hAnsi="Times New Roman"/>
-          <w:sz w:val="24"/>
-          <w:szCs w:val="24"/>
-        </w:rPr>
-        <w:t xml:space="preserve">(4), e60188.</w:t>
+        <w:t xml:space="preserve">Psychological Review, 97</w:t>
+      </w:r>
+      <w:r>
+        <w:rPr>
+          <w:rFonts w:ascii="Times New Roman" w:cs="Times New Roman" w:eastAsia="Times New Roman" w:hAnsi="Times New Roman"/>
+          <w:sz w:val="24"/>
+          <w:szCs w:val="24"/>
+        </w:rPr>
+        <w:t xml:space="preserve">(1), 19–35.</w:t>
       </w:r>
       <w:r>
         <w:rPr>
@@ -7906,7 +7940,7 @@
           <w:szCs w:val="24"/>
           <w:u w:val="single"/>
         </w:rPr>
-        <w:t xml:space="preserve"> https://doi.org/10.1371/journal.pone.0060188</w:t>
+        <w:t xml:space="preserve"> https://doi.org/10.1037/0033-295X.97.1.19</w:t>
       </w:r>
     </w:p>
     <w:p>
@@ -7920,21 +7954,7 @@
           <w:sz w:val="24"/>
           <w:szCs w:val="24"/>
         </w:rPr>
-        <w:t xml:space="preserve">Bringmann, L. F., Albers, C., Bockting, C., Borsboom, D., Ceulemans, E., Cramer, A. O. J., ... &amp; Wichers, M. (2022). Psychopathological networks: Theory, methods and practice. Behaviour Research and Therapy, 149, 104011. https://doi.org/10.1016/j.brat.2021.104011</w:t>
-      </w:r>
-    </w:p>
-    <w:p>
-      <w:pPr>
-        <w:spacing w:after="120" w:before="0" w:line="480"/>
-        <w:ind w:left="720" w:hanging="720"/>
-      </w:pPr>
-      <w:r>
-        <w:rPr>
-          <w:rFonts w:ascii="Times New Roman" w:cs="Times New Roman" w:eastAsia="Times New Roman" w:hAnsi="Times New Roman"/>
-          <w:sz w:val="24"/>
-          <w:szCs w:val="24"/>
-        </w:rPr>
-        <w:t xml:space="preserve">Bürkner, P.-C. (2017). brms: An R package for Bayesian multilevel models using Stan. </w:t>
+        <w:t xml:space="preserve">Carver, C. S., &amp; Scheier, M. F. (1998). </w:t>
       </w:r>
       <w:r>
         <w:rPr>
@@ -7944,25 +7964,15 @@
           <w:sz w:val="24"/>
           <w:szCs w:val="24"/>
         </w:rPr>
-        <w:t xml:space="preserve">Journal of Statistical Software, 80</w:t>
-      </w:r>
-      <w:r>
-        <w:rPr>
-          <w:rFonts w:ascii="Times New Roman" w:cs="Times New Roman" w:eastAsia="Times New Roman" w:hAnsi="Times New Roman"/>
-          <w:sz w:val="24"/>
-          <w:szCs w:val="24"/>
-        </w:rPr>
-        <w:t xml:space="preserve">(1), 1–28.</w:t>
-      </w:r>
-      <w:r>
-        <w:rPr>
-          <w:rFonts w:ascii="Times New Roman" w:cs="Times New Roman" w:eastAsia="Times New Roman" w:hAnsi="Times New Roman"/>
-          <w:color w:val="1A56DB"/>
-          <w:sz w:val="24"/>
-          <w:szCs w:val="24"/>
-          <w:u w:val="single"/>
-        </w:rPr>
-        <w:t xml:space="preserve"> https://doi.org/10.18637/jss.v080.i01</w:t>
+        <w:t xml:space="preserve">On the self-regulation of behavior</w:t>
+      </w:r>
+      <w:r>
+        <w:rPr>
+          <w:rFonts w:ascii="Times New Roman" w:cs="Times New Roman" w:eastAsia="Times New Roman" w:hAnsi="Times New Roman"/>
+          <w:sz w:val="24"/>
+          <w:szCs w:val="24"/>
+        </w:rPr>
+        <w:t xml:space="preserve">. Cambridge University Press.</w:t>
       </w:r>
     </w:p>
     <w:p>
@@ -7976,7 +7986,7 @@
           <w:sz w:val="24"/>
           <w:szCs w:val="24"/>
         </w:rPr>
-        <w:t xml:space="preserve">Carver, C. S., &amp; Scheier, M. F. (1990). Origins and functions of positive and negative affect: A control-process view. </w:t>
+        <w:t xml:space="preserve">Conner, T. S., &amp; Reid, K. A. (2012). Effects of intensive mobile happiness reporting in daily life. </w:t>
       </w:r>
       <w:r>
         <w:rPr>
@@ -7986,15 +7996,15 @@
           <w:sz w:val="24"/>
           <w:szCs w:val="24"/>
         </w:rPr>
-        <w:t xml:space="preserve">Psychological Review, 97</w:t>
-      </w:r>
-      <w:r>
-        <w:rPr>
-          <w:rFonts w:ascii="Times New Roman" w:cs="Times New Roman" w:eastAsia="Times New Roman" w:hAnsi="Times New Roman"/>
-          <w:sz w:val="24"/>
-          <w:szCs w:val="24"/>
-        </w:rPr>
-        <w:t xml:space="preserve">(1), 19–35.</w:t>
+        <w:t xml:space="preserve">Social Psychological and Personality Science, 3</w:t>
+      </w:r>
+      <w:r>
+        <w:rPr>
+          <w:rFonts w:ascii="Times New Roman" w:cs="Times New Roman" w:eastAsia="Times New Roman" w:hAnsi="Times New Roman"/>
+          <w:sz w:val="24"/>
+          <w:szCs w:val="24"/>
+        </w:rPr>
+        <w:t xml:space="preserve">(3), 315–323.</w:t>
       </w:r>
       <w:r>
         <w:rPr>
@@ -8004,21 +8014,21 @@
           <w:szCs w:val="24"/>
           <w:u w:val="single"/>
         </w:rPr>
-        <w:t xml:space="preserve"> https://doi.org/10.1037/0033-295X.97.1.19</w:t>
-      </w:r>
-    </w:p>
-    <w:p>
-      <w:pPr>
-        <w:spacing w:after="120" w:before="0" w:line="480"/>
-        <w:ind w:left="720" w:hanging="720"/>
-      </w:pPr>
-      <w:r>
-        <w:rPr>
-          <w:rFonts w:ascii="Times New Roman" w:cs="Times New Roman" w:eastAsia="Times New Roman" w:hAnsi="Times New Roman"/>
-          <w:sz w:val="24"/>
-          <w:szCs w:val="24"/>
-        </w:rPr>
-        <w:t xml:space="preserve">Carver, C. S., &amp; Scheier, M. F. (1998). </w:t>
+        <w:t xml:space="preserve"> https://doi.org/10.1177/1948550611419677</w:t>
+      </w:r>
+    </w:p>
+    <w:p>
+      <w:pPr>
+        <w:spacing w:after="120" w:before="0" w:line="480"/>
+        <w:ind w:hanging="720" w:left="720"/>
+      </w:pPr>
+      <w:r>
+        <w:rPr>
+          <w:rFonts w:ascii="Times New Roman" w:cs="Times New Roman" w:eastAsia="Times New Roman" w:hAnsi="Times New Roman"/>
+          <w:sz w:val="24"/>
+          <w:szCs w:val="24"/>
+        </w:rPr>
+        <w:t xml:space="preserve">Craig, A. D. (2009). How do you feel — now? The anterior insula and human awareness. </w:t>
       </w:r>
       <w:r>
         <w:rPr>
@@ -8028,15 +8038,25 @@
           <w:sz w:val="24"/>
           <w:szCs w:val="24"/>
         </w:rPr>
-        <w:t xml:space="preserve">On the self-regulation of behavior</w:t>
-      </w:r>
-      <w:r>
-        <w:rPr>
-          <w:rFonts w:ascii="Times New Roman" w:cs="Times New Roman" w:eastAsia="Times New Roman" w:hAnsi="Times New Roman"/>
-          <w:sz w:val="24"/>
-          <w:szCs w:val="24"/>
-        </w:rPr>
-        <w:t xml:space="preserve">. Cambridge University Press.</w:t>
+        <w:t xml:space="preserve">Nature Reviews Neuroscience, 10</w:t>
+      </w:r>
+      <w:r>
+        <w:rPr>
+          <w:rFonts w:ascii="Times New Roman" w:cs="Times New Roman" w:eastAsia="Times New Roman" w:hAnsi="Times New Roman"/>
+          <w:sz w:val="24"/>
+          <w:szCs w:val="24"/>
+        </w:rPr>
+        <w:t xml:space="preserve">(1), 59–70.</w:t>
+      </w:r>
+      <w:r>
+        <w:rPr>
+          <w:rFonts w:ascii="Times New Roman" w:cs="Times New Roman" w:eastAsia="Times New Roman" w:hAnsi="Times New Roman"/>
+          <w:color w:val="1A56DB"/>
+          <w:sz w:val="24"/>
+          <w:szCs w:val="24"/>
+          <w:u w:val="single"/>
+        </w:rPr>
+        <w:t xml:space="preserve"> https://doi.org/10.1038/nrn2555</w:t>
       </w:r>
     </w:p>
     <w:p>
@@ -8050,7 +8070,7 @@
           <w:sz w:val="24"/>
           <w:szCs w:val="24"/>
         </w:rPr>
-        <w:t xml:space="preserve">Conner, T. S., &amp; Reid, K. A. (2012). Effects of intensive mobile happiness reporting in daily life. </w:t>
+        <w:t xml:space="preserve">Damasio, A. R. (1999). </w:t>
       </w:r>
       <w:r>
         <w:rPr>
@@ -8060,39 +8080,29 @@
           <w:sz w:val="24"/>
           <w:szCs w:val="24"/>
         </w:rPr>
-        <w:t xml:space="preserve">Social Psychological and Personality Science, 3</w:t>
-      </w:r>
-      <w:r>
-        <w:rPr>
-          <w:rFonts w:ascii="Times New Roman" w:cs="Times New Roman" w:eastAsia="Times New Roman" w:hAnsi="Times New Roman"/>
-          <w:sz w:val="24"/>
-          <w:szCs w:val="24"/>
-        </w:rPr>
-        <w:t xml:space="preserve">(3), 315–323.</w:t>
-      </w:r>
-      <w:r>
-        <w:rPr>
-          <w:rFonts w:ascii="Times New Roman" w:cs="Times New Roman" w:eastAsia="Times New Roman" w:hAnsi="Times New Roman"/>
-          <w:color w:val="1A56DB"/>
-          <w:sz w:val="24"/>
-          <w:szCs w:val="24"/>
-          <w:u w:val="single"/>
-        </w:rPr>
-        <w:t xml:space="preserve"> https://doi.org/10.1177/1948550611419677</w:t>
-      </w:r>
-    </w:p>
-    <w:p>
-      <w:pPr>
-        <w:spacing w:after="120" w:before="0" w:line="480"/>
-        <w:ind w:hanging="720" w:left="720"/>
-      </w:pPr>
-      <w:r>
-        <w:rPr>
-          <w:rFonts w:ascii="Times New Roman" w:cs="Times New Roman" w:eastAsia="Times New Roman" w:hAnsi="Times New Roman"/>
-          <w:sz w:val="24"/>
-          <w:szCs w:val="24"/>
-        </w:rPr>
-        <w:t xml:space="preserve">Craig, A. D. (2009). How do you feel — now? The anterior insula and human awareness. </w:t>
+        <w:t xml:space="preserve">The feeling of what happens: Body and emotion in the making of consciousness</w:t>
+      </w:r>
+      <w:r>
+        <w:rPr>
+          <w:rFonts w:ascii="Times New Roman" w:cs="Times New Roman" w:eastAsia="Times New Roman" w:hAnsi="Times New Roman"/>
+          <w:sz w:val="24"/>
+          <w:szCs w:val="24"/>
+        </w:rPr>
+        <w:t xml:space="preserve">. Harcourt.</w:t>
+      </w:r>
+    </w:p>
+    <w:p>
+      <w:pPr>
+        <w:spacing w:after="120" w:before="0" w:line="480"/>
+        <w:ind w:left="720" w:hanging="720"/>
+      </w:pPr>
+      <w:r>
+        <w:rPr>
+          <w:rFonts w:ascii="Times New Roman" w:cs="Times New Roman" w:eastAsia="Times New Roman" w:hAnsi="Times New Roman"/>
+          <w:sz w:val="24"/>
+          <w:szCs w:val="24"/>
+        </w:rPr>
+        <w:t xml:space="preserve">Deci, E. L., &amp; Ryan, R. M. (2000). The “what” and “why” of goal pursuits: Human needs and the self-determination of behavior. </w:t>
       </w:r>
       <w:r>
         <w:rPr>
@@ -8102,15 +8112,15 @@
           <w:sz w:val="24"/>
           <w:szCs w:val="24"/>
         </w:rPr>
-        <w:t xml:space="preserve">Nature Reviews Neuroscience, 10</w:t>
-      </w:r>
-      <w:r>
-        <w:rPr>
-          <w:rFonts w:ascii="Times New Roman" w:cs="Times New Roman" w:eastAsia="Times New Roman" w:hAnsi="Times New Roman"/>
-          <w:sz w:val="24"/>
-          <w:szCs w:val="24"/>
-        </w:rPr>
-        <w:t xml:space="preserve">(1), 59–70.</w:t>
+        <w:t xml:space="preserve">Psychological Inquiry, 11</w:t>
+      </w:r>
+      <w:r>
+        <w:rPr>
+          <w:rFonts w:ascii="Times New Roman" w:cs="Times New Roman" w:eastAsia="Times New Roman" w:hAnsi="Times New Roman"/>
+          <w:sz w:val="24"/>
+          <w:szCs w:val="24"/>
+        </w:rPr>
+        <w:t xml:space="preserve">(4), 227–268.</w:t>
       </w:r>
       <w:r>
         <w:rPr>
@@ -8120,7 +8130,7 @@
           <w:szCs w:val="24"/>
           <w:u w:val="single"/>
         </w:rPr>
-        <w:t xml:space="preserve"> https://doi.org/10.1038/nrn2555</w:t>
+        <w:t xml:space="preserve"> https://doi.org/10.1207/S15327965PLI1104_01</w:t>
       </w:r>
     </w:p>
     <w:p>
@@ -8134,7 +8144,7 @@
           <w:sz w:val="24"/>
           <w:szCs w:val="24"/>
         </w:rPr>
-        <w:t xml:space="preserve">Damasio, A. R. (1999). </w:t>
+        <w:t xml:space="preserve">Dejonckheere, E., Demeyer, F., Geusens, B., Piot, M., Tuerlinckx, F., Verdonck, S., &amp; Mestdagh, M. (2022). Assessing the reliability of single-item momentary affective measurements in experience sampling. </w:t>
       </w:r>
       <w:r>
         <w:rPr>
@@ -8144,15 +8154,25 @@
           <w:sz w:val="24"/>
           <w:szCs w:val="24"/>
         </w:rPr>
-        <w:t xml:space="preserve">The feeling of what happens: Body and emotion in the making of consciousness</w:t>
-      </w:r>
-      <w:r>
-        <w:rPr>
-          <w:rFonts w:ascii="Times New Roman" w:cs="Times New Roman" w:eastAsia="Times New Roman" w:hAnsi="Times New Roman"/>
-          <w:sz w:val="24"/>
-          <w:szCs w:val="24"/>
-        </w:rPr>
-        <w:t xml:space="preserve">. Harcourt.</w:t>
+        <w:t xml:space="preserve">Psychological Assessment, 34</w:t>
+      </w:r>
+      <w:r>
+        <w:rPr>
+          <w:rFonts w:ascii="Times New Roman" w:cs="Times New Roman" w:eastAsia="Times New Roman" w:hAnsi="Times New Roman"/>
+          <w:sz w:val="24"/>
+          <w:szCs w:val="24"/>
+        </w:rPr>
+        <w:t xml:space="preserve">(12), 1138–1154.</w:t>
+      </w:r>
+      <w:r>
+        <w:rPr>
+          <w:rFonts w:ascii="Times New Roman" w:cs="Times New Roman" w:eastAsia="Times New Roman" w:hAnsi="Times New Roman"/>
+          <w:color w:val="1A56DB"/>
+          <w:sz w:val="24"/>
+          <w:szCs w:val="24"/>
+          <w:u w:val="single"/>
+        </w:rPr>
+        <w:t xml:space="preserve"> https://doi.org/10.1037/pas0001178</w:t>
       </w:r>
     </w:p>
     <w:p>
@@ -8166,7 +8186,7 @@
           <w:sz w:val="24"/>
           <w:szCs w:val="24"/>
         </w:rPr>
-        <w:t xml:space="preserve">Deci, E. L., &amp; Ryan, R. M. (2000). The “what” and “why” of goal pursuits: Human needs and the self-determination of behavior. </w:t>
+        <w:t xml:space="preserve">Efklides, A. (2008). Metacognition: Defining its facets and levels of functioning in relation to self-regulation and co-regulation. </w:t>
       </w:r>
       <w:r>
         <w:rPr>
@@ -8176,15 +8196,15 @@
           <w:sz w:val="24"/>
           <w:szCs w:val="24"/>
         </w:rPr>
-        <w:t xml:space="preserve">Psychological Inquiry, 11</w:t>
-      </w:r>
-      <w:r>
-        <w:rPr>
-          <w:rFonts w:ascii="Times New Roman" w:cs="Times New Roman" w:eastAsia="Times New Roman" w:hAnsi="Times New Roman"/>
-          <w:sz w:val="24"/>
-          <w:szCs w:val="24"/>
-        </w:rPr>
-        <w:t xml:space="preserve">(4), 227–268.</w:t>
+        <w:t xml:space="preserve">European Psychologist, 13</w:t>
+      </w:r>
+      <w:r>
+        <w:rPr>
+          <w:rFonts w:ascii="Times New Roman" w:cs="Times New Roman" w:eastAsia="Times New Roman" w:hAnsi="Times New Roman"/>
+          <w:sz w:val="24"/>
+          <w:szCs w:val="24"/>
+        </w:rPr>
+        <w:t xml:space="preserve">(4), 277–287.</w:t>
       </w:r>
       <w:r>
         <w:rPr>
@@ -8194,7 +8214,7 @@
           <w:szCs w:val="24"/>
           <w:u w:val="single"/>
         </w:rPr>
-        <w:t xml:space="preserve"> https://doi.org/10.1207/S15327965PLI1104_01</w:t>
+        <w:t xml:space="preserve"> https://doi.org/10.1027/1016-9040.13.4.277</w:t>
       </w:r>
     </w:p>
     <w:p>
@@ -8208,7 +8228,7 @@
           <w:sz w:val="24"/>
           <w:szCs w:val="24"/>
         </w:rPr>
-        <w:t xml:space="preserve">Dejonckheere, E., Demeyer, F., Geusens, B., Piot, M., Tuerlinckx, F., Verdonck, S., &amp; Mestdagh, M. (2022). Assessing the reliability of single-item momentary affective measurements in experience sampling. </w:t>
+        <w:t xml:space="preserve">Eisele, G., Vachon, H., Lafit, G., Kuppens, P., Houben, M., Myin-Germeys, I., &amp; Viechtbauer, W. (2022). The effects of sampling frequency and questionnaire length on perceived burden, compliance, and careless responding in experience sampling data in a student population. </w:t>
       </w:r>
       <w:r>
         <w:rPr>
@@ -8218,15 +8238,15 @@
           <w:sz w:val="24"/>
           <w:szCs w:val="24"/>
         </w:rPr>
-        <w:t xml:space="preserve">Psychological Assessment, 34</w:t>
-      </w:r>
-      <w:r>
-        <w:rPr>
-          <w:rFonts w:ascii="Times New Roman" w:cs="Times New Roman" w:eastAsia="Times New Roman" w:hAnsi="Times New Roman"/>
-          <w:sz w:val="24"/>
-          <w:szCs w:val="24"/>
-        </w:rPr>
-        <w:t xml:space="preserve">(12), 1138–1154.</w:t>
+        <w:t xml:space="preserve">Assessment, 29</w:t>
+      </w:r>
+      <w:r>
+        <w:rPr>
+          <w:rFonts w:ascii="Times New Roman" w:cs="Times New Roman" w:eastAsia="Times New Roman" w:hAnsi="Times New Roman"/>
+          <w:sz w:val="24"/>
+          <w:szCs w:val="24"/>
+        </w:rPr>
+        <w:t xml:space="preserve">(2), 136–151.</w:t>
       </w:r>
       <w:r>
         <w:rPr>
@@ -8236,7 +8256,7 @@
           <w:szCs w:val="24"/>
           <w:u w:val="single"/>
         </w:rPr>
-        <w:t xml:space="preserve"> https://doi.org/10.1037/pas0001178</w:t>
+        <w:t xml:space="preserve"> https://doi.org/10.1177/1073191120957102</w:t>
       </w:r>
     </w:p>
     <w:p>
@@ -8250,7 +8270,7 @@
           <w:sz w:val="24"/>
           <w:szCs w:val="24"/>
         </w:rPr>
-        <w:t xml:space="preserve">Efklides, A. (2008). Metacognition: Defining its facets and levels of functioning in relation to self-regulation and co-regulation. </w:t>
+        <w:t xml:space="preserve">Flavell, J. H. (1979). Metacognition and cognitive monitoring: A new area of cognitive–developmental inquiry. </w:t>
       </w:r>
       <w:r>
         <w:rPr>
@@ -8260,15 +8280,15 @@
           <w:sz w:val="24"/>
           <w:szCs w:val="24"/>
         </w:rPr>
-        <w:t xml:space="preserve">European Psychologist, 13</w:t>
-      </w:r>
-      <w:r>
-        <w:rPr>
-          <w:rFonts w:ascii="Times New Roman" w:cs="Times New Roman" w:eastAsia="Times New Roman" w:hAnsi="Times New Roman"/>
-          <w:sz w:val="24"/>
-          <w:szCs w:val="24"/>
-        </w:rPr>
-        <w:t xml:space="preserve">(4), 277–287.</w:t>
+        <w:t xml:space="preserve">American Psychologist, 34</w:t>
+      </w:r>
+      <w:r>
+        <w:rPr>
+          <w:rFonts w:ascii="Times New Roman" w:cs="Times New Roman" w:eastAsia="Times New Roman" w:hAnsi="Times New Roman"/>
+          <w:sz w:val="24"/>
+          <w:szCs w:val="24"/>
+        </w:rPr>
+        <w:t xml:space="preserve">(10), 906–911.</w:t>
       </w:r>
       <w:r>
         <w:rPr>
@@ -8278,7 +8298,7 @@
           <w:szCs w:val="24"/>
           <w:u w:val="single"/>
         </w:rPr>
-        <w:t xml:space="preserve"> https://doi.org/10.1027/1016-9040.13.4.277</w:t>
+        <w:t xml:space="preserve"> https://doi.org/10.1037/0003-066X.34.10.906</w:t>
       </w:r>
     </w:p>
     <w:p>
@@ -8292,7 +8312,7 @@
           <w:sz w:val="24"/>
           <w:szCs w:val="24"/>
         </w:rPr>
-        <w:t xml:space="preserve">Eisele, G., Vachon, H., Lafit, G., Kuppens, P., Houben, M., Myin-Germeys, I., &amp; Viechtbauer, W. (2022). The effects of sampling frequency and questionnaire length on perceived burden, compliance, and careless responding in experience sampling data in a student population. </w:t>
+        <w:t xml:space="preserve">Frijda, N. H. (1986). </w:t>
       </w:r>
       <w:r>
         <w:rPr>
@@ -8302,25 +8322,15 @@
           <w:sz w:val="24"/>
           <w:szCs w:val="24"/>
         </w:rPr>
-        <w:t xml:space="preserve">Assessment, 29</w:t>
-      </w:r>
-      <w:r>
-        <w:rPr>
-          <w:rFonts w:ascii="Times New Roman" w:cs="Times New Roman" w:eastAsia="Times New Roman" w:hAnsi="Times New Roman"/>
-          <w:sz w:val="24"/>
-          <w:szCs w:val="24"/>
-        </w:rPr>
-        <w:t xml:space="preserve">(2), 136–151.</w:t>
-      </w:r>
-      <w:r>
-        <w:rPr>
-          <w:rFonts w:ascii="Times New Roman" w:cs="Times New Roman" w:eastAsia="Times New Roman" w:hAnsi="Times New Roman"/>
-          <w:color w:val="1A56DB"/>
-          <w:sz w:val="24"/>
-          <w:szCs w:val="24"/>
-          <w:u w:val="single"/>
-        </w:rPr>
-        <w:t xml:space="preserve"> https://doi.org/10.1177/1073191120957102</w:t>
+        <w:t xml:space="preserve">The emotions</w:t>
+      </w:r>
+      <w:r>
+        <w:rPr>
+          <w:rFonts w:ascii="Times New Roman" w:cs="Times New Roman" w:eastAsia="Times New Roman" w:hAnsi="Times New Roman"/>
+          <w:sz w:val="24"/>
+          <w:szCs w:val="24"/>
+        </w:rPr>
+        <w:t xml:space="preserve">. Cambridge University Press.</w:t>
       </w:r>
     </w:p>
     <w:p>
@@ -8334,7 +8344,7 @@
           <w:sz w:val="24"/>
           <w:szCs w:val="24"/>
         </w:rPr>
-        <w:t xml:space="preserve">Flavell, J. H. (1979). Metacognition and cognitive monitoring: A new area of cognitive–developmental inquiry. </w:t>
+        <w:t xml:space="preserve">Giddens, A. (1984). </w:t>
       </w:r>
       <w:r>
         <w:rPr>
@@ -8344,25 +8354,15 @@
           <w:sz w:val="24"/>
           <w:szCs w:val="24"/>
         </w:rPr>
-        <w:t xml:space="preserve">American Psychologist, 34</w:t>
-      </w:r>
-      <w:r>
-        <w:rPr>
-          <w:rFonts w:ascii="Times New Roman" w:cs="Times New Roman" w:eastAsia="Times New Roman" w:hAnsi="Times New Roman"/>
-          <w:sz w:val="24"/>
-          <w:szCs w:val="24"/>
-        </w:rPr>
-        <w:t xml:space="preserve">(10), 906–911.</w:t>
-      </w:r>
-      <w:r>
-        <w:rPr>
-          <w:rFonts w:ascii="Times New Roman" w:cs="Times New Roman" w:eastAsia="Times New Roman" w:hAnsi="Times New Roman"/>
-          <w:color w:val="1A56DB"/>
-          <w:sz w:val="24"/>
-          <w:szCs w:val="24"/>
-          <w:u w:val="single"/>
-        </w:rPr>
-        <w:t xml:space="preserve"> https://doi.org/10.1037/0003-066X.34.10.906</w:t>
+        <w:t xml:space="preserve">The constitution of society: Outline of the theory of structuration</w:t>
+      </w:r>
+      <w:r>
+        <w:rPr>
+          <w:rFonts w:ascii="Times New Roman" w:cs="Times New Roman" w:eastAsia="Times New Roman" w:hAnsi="Times New Roman"/>
+          <w:sz w:val="24"/>
+          <w:szCs w:val="24"/>
+        </w:rPr>
+        <w:t xml:space="preserve">. University of California Press.</w:t>
       </w:r>
     </w:p>
     <w:p>
@@ -8376,7 +8376,7 @@
           <w:sz w:val="24"/>
           <w:szCs w:val="24"/>
         </w:rPr>
-        <w:t xml:space="preserve">Frijda, N. H. (1986). </w:t>
+        <w:t xml:space="preserve">Hamaker, E. L. (2012). Why researchers should think “within-person”: A paradigmatic rationale. In M. R. Mehl &amp; T. S. Conner (Eds.), </w:t>
       </w:r>
       <w:r>
         <w:rPr>
@@ -8386,15 +8386,15 @@
           <w:sz w:val="24"/>
           <w:szCs w:val="24"/>
         </w:rPr>
-        <w:t xml:space="preserve">The emotions</w:t>
-      </w:r>
-      <w:r>
-        <w:rPr>
-          <w:rFonts w:ascii="Times New Roman" w:cs="Times New Roman" w:eastAsia="Times New Roman" w:hAnsi="Times New Roman"/>
-          <w:sz w:val="24"/>
-          <w:szCs w:val="24"/>
-        </w:rPr>
-        <w:t xml:space="preserve">. Cambridge University Press.</w:t>
+        <w:t xml:space="preserve">Handbook of research methods for studying daily life</w:t>
+      </w:r>
+      <w:r>
+        <w:rPr>
+          <w:rFonts w:ascii="Times New Roman" w:cs="Times New Roman" w:eastAsia="Times New Roman" w:hAnsi="Times New Roman"/>
+          <w:sz w:val="24"/>
+          <w:szCs w:val="24"/>
+        </w:rPr>
+        <w:t xml:space="preserve"> (pp. 43–61). Guilford Press.</w:t>
       </w:r>
     </w:p>
     <w:p>
@@ -8408,7 +8408,7 @@
           <w:sz w:val="24"/>
           <w:szCs w:val="24"/>
         </w:rPr>
-        <w:t xml:space="preserve">Frith, C. (2005). The self in action: Lessons from delusions of control. </w:t>
+        <w:t xml:space="preserve">Houben, M., Van Den Noortgate, W., &amp; Kuppens, P. (2015). The relation between short-term emotion dynamics and psychological well-being: A meta-analysis. </w:t>
       </w:r>
       <w:r>
         <w:rPr>
@@ -8418,15 +8418,15 @@
           <w:sz w:val="24"/>
           <w:szCs w:val="24"/>
         </w:rPr>
-        <w:t xml:space="preserve">Consciousness and Cognition, 14</w:t>
-      </w:r>
-      <w:r>
-        <w:rPr>
-          <w:rFonts w:ascii="Times New Roman" w:cs="Times New Roman" w:eastAsia="Times New Roman" w:hAnsi="Times New Roman"/>
-          <w:sz w:val="24"/>
-          <w:szCs w:val="24"/>
-        </w:rPr>
-        <w:t xml:space="preserve">(4), 752–770.</w:t>
+        <w:t xml:space="preserve">Psychological Bulletin, 141</w:t>
+      </w:r>
+      <w:r>
+        <w:rPr>
+          <w:rFonts w:ascii="Times New Roman" w:cs="Times New Roman" w:eastAsia="Times New Roman" w:hAnsi="Times New Roman"/>
+          <w:sz w:val="24"/>
+          <w:szCs w:val="24"/>
+        </w:rPr>
+        <w:t xml:space="preserve">(4), 901–930.</w:t>
       </w:r>
       <w:r>
         <w:rPr>
@@ -8436,7 +8436,7 @@
           <w:szCs w:val="24"/>
           <w:u w:val="single"/>
         </w:rPr>
-        <w:t xml:space="preserve"> https://doi.org/10.1016/j.concog.2005.04.002</w:t>
+        <w:t xml:space="preserve"> https://doi.org/10.1037/a0038822</w:t>
       </w:r>
     </w:p>
     <w:p>
@@ -8450,7 +8450,7 @@
           <w:sz w:val="24"/>
           <w:szCs w:val="24"/>
         </w:rPr>
-        <w:t xml:space="preserve">Giddens, A. (1984). </w:t>
+        <w:t xml:space="preserve">Jahng, S., Wood, P. K., &amp; Trull, T. J. (2008). Analysis of affective instability in ecological momentary assessment: Indices using successive difference and group comparison via multilevel modeling. </w:t>
       </w:r>
       <w:r>
         <w:rPr>
@@ -8460,15 +8460,25 @@
           <w:sz w:val="24"/>
           <w:szCs w:val="24"/>
         </w:rPr>
-        <w:t xml:space="preserve">The constitution of society: Outline of the theory of structuration</w:t>
-      </w:r>
-      <w:r>
-        <w:rPr>
-          <w:rFonts w:ascii="Times New Roman" w:cs="Times New Roman" w:eastAsia="Times New Roman" w:hAnsi="Times New Roman"/>
-          <w:sz w:val="24"/>
-          <w:szCs w:val="24"/>
-        </w:rPr>
-        <w:t xml:space="preserve">. University of California Press.</w:t>
+        <w:t xml:space="preserve">Psychological Methods, 13</w:t>
+      </w:r>
+      <w:r>
+        <w:rPr>
+          <w:rFonts w:ascii="Times New Roman" w:cs="Times New Roman" w:eastAsia="Times New Roman" w:hAnsi="Times New Roman"/>
+          <w:sz w:val="24"/>
+          <w:szCs w:val="24"/>
+        </w:rPr>
+        <w:t xml:space="preserve">(4), 354–375.</w:t>
+      </w:r>
+      <w:r>
+        <w:rPr>
+          <w:rFonts w:ascii="Times New Roman" w:cs="Times New Roman" w:eastAsia="Times New Roman" w:hAnsi="Times New Roman"/>
+          <w:color w:val="1A56DB"/>
+          <w:sz w:val="24"/>
+          <w:szCs w:val="24"/>
+          <w:u w:val="single"/>
+        </w:rPr>
+        <w:t xml:space="preserve"> https://doi.org/10.1037/a0014173</w:t>
       </w:r>
     </w:p>
     <w:p>
@@ -8482,7 +8492,21 @@
           <w:sz w:val="24"/>
           <w:szCs w:val="24"/>
         </w:rPr>
-        <w:t xml:space="preserve">Haggard, P. (2017). Sense of agency in the human brain. </w:t>
+        <w:t xml:space="preserve">Knapen, S. E., Snippe, E., Smit, A. C., Schoevers, R. A., &amp; Riemersma-van der Lek, R. F. (2025). Sleep disturbances in the prodromal phase of mood episodes in patients with bipolar disorder: A replicated single-case design. Journal for Person-Oriented Research, 11(3), 142-168. https://doi.org/10.17505/jpor.2025.28202</w:t>
+      </w:r>
+    </w:p>
+    <w:p>
+      <w:pPr>
+        <w:spacing w:after="120" w:before="0" w:line="480"/>
+        <w:ind w:left="720" w:hanging="720"/>
+      </w:pPr>
+      <w:r>
+        <w:rPr>
+          <w:rFonts w:ascii="Times New Roman" w:cs="Times New Roman" w:eastAsia="Times New Roman" w:hAnsi="Times New Roman"/>
+          <w:sz w:val="24"/>
+          <w:szCs w:val="24"/>
+        </w:rPr>
+        <w:t xml:space="preserve">Koval, P., &amp; Kuppens, P. (2012). Changing emotion dynamics: Individual differences in the effect of anticipatory social stress on emotional inertia. </w:t>
       </w:r>
       <w:r>
         <w:rPr>
@@ -8492,15 +8516,15 @@
           <w:sz w:val="24"/>
           <w:szCs w:val="24"/>
         </w:rPr>
-        <w:t xml:space="preserve">Nature Reviews Neuroscience, 18</w:t>
-      </w:r>
-      <w:r>
-        <w:rPr>
-          <w:rFonts w:ascii="Times New Roman" w:cs="Times New Roman" w:eastAsia="Times New Roman" w:hAnsi="Times New Roman"/>
-          <w:sz w:val="24"/>
-          <w:szCs w:val="24"/>
-        </w:rPr>
-        <w:t xml:space="preserve">(4), 196–207.</w:t>
+        <w:t xml:space="preserve">Emotion, 12</w:t>
+      </w:r>
+      <w:r>
+        <w:rPr>
+          <w:rFonts w:ascii="Times New Roman" w:cs="Times New Roman" w:eastAsia="Times New Roman" w:hAnsi="Times New Roman"/>
+          <w:sz w:val="24"/>
+          <w:szCs w:val="24"/>
+        </w:rPr>
+        <w:t xml:space="preserve">(2), 256–267.</w:t>
       </w:r>
       <w:r>
         <w:rPr>
@@ -8510,7 +8534,7 @@
           <w:szCs w:val="24"/>
           <w:u w:val="single"/>
         </w:rPr>
-        <w:t xml:space="preserve"> https://doi.org/10.1038/nrn.2017.14</w:t>
+        <w:t xml:space="preserve"> https://doi.org/10.1037/a0024756</w:t>
       </w:r>
     </w:p>
     <w:p>
@@ -8524,7 +8548,7 @@
           <w:sz w:val="24"/>
           <w:szCs w:val="24"/>
         </w:rPr>
-        <w:t xml:space="preserve">Hamaker, E. L. (2012). Why researchers should think “within-person”: A paradigmatic rationale. In M. R. Mehl &amp; T. S. Conner (Eds.), </w:t>
+        <w:t xml:space="preserve">Kuppens, P., Allen, N. B., &amp; Sheeber, L. B. (2010). Emotional inertia and psychological maladjustment. </w:t>
       </w:r>
       <w:r>
         <w:rPr>
@@ -8534,29 +8558,39 @@
           <w:sz w:val="24"/>
           <w:szCs w:val="24"/>
         </w:rPr>
-        <w:t xml:space="preserve">Handbook of research methods for studying daily life</w:t>
-      </w:r>
-      <w:r>
-        <w:rPr>
-          <w:rFonts w:ascii="Times New Roman" w:cs="Times New Roman" w:eastAsia="Times New Roman" w:hAnsi="Times New Roman"/>
-          <w:sz w:val="24"/>
-          <w:szCs w:val="24"/>
-        </w:rPr>
-        <w:t xml:space="preserve"> (pp. 43–61). Guilford Press.</w:t>
-      </w:r>
-    </w:p>
-    <w:p>
-      <w:pPr>
-        <w:spacing w:after="120" w:before="0" w:line="480"/>
-        <w:ind w:left="720" w:hanging="720"/>
-      </w:pPr>
-      <w:r>
-        <w:rPr>
-          <w:rFonts w:ascii="Times New Roman" w:cs="Times New Roman" w:eastAsia="Times New Roman" w:hAnsi="Times New Roman"/>
-          <w:sz w:val="24"/>
-          <w:szCs w:val="24"/>
-        </w:rPr>
-        <w:t xml:space="preserve">Houben, M., Van Den Noortgate, W., &amp; Kuppens, P. (2015). The relation between short-term emotion dynamics and psychological well-being: A meta-analysis. </w:t>
+        <w:t xml:space="preserve">Psychological Science, 21</w:t>
+      </w:r>
+      <w:r>
+        <w:rPr>
+          <w:rFonts w:ascii="Times New Roman" w:cs="Times New Roman" w:eastAsia="Times New Roman" w:hAnsi="Times New Roman"/>
+          <w:sz w:val="24"/>
+          <w:szCs w:val="24"/>
+        </w:rPr>
+        <w:t xml:space="preserve">(7), 984–991.</w:t>
+      </w:r>
+      <w:r>
+        <w:rPr>
+          <w:rFonts w:ascii="Times New Roman" w:cs="Times New Roman" w:eastAsia="Times New Roman" w:hAnsi="Times New Roman"/>
+          <w:color w:val="1A56DB"/>
+          <w:sz w:val="24"/>
+          <w:szCs w:val="24"/>
+          <w:u w:val="single"/>
+        </w:rPr>
+        <w:t xml:space="preserve"> https://doi.org/10.1177/0956797610372634</w:t>
+      </w:r>
+    </w:p>
+    <w:p>
+      <w:pPr>
+        <w:spacing w:after="120" w:before="0" w:line="480"/>
+        <w:jc w:val="both"/>
+      </w:pPr>
+      <w:r>
+        <w:rPr>
+          <w:rFonts w:ascii="Times New Roman" w:cs="Times New Roman" w:eastAsia="Times New Roman" w:hAnsi="Times New Roman"/>
+          <w:sz w:val="24"/>
+          <w:szCs w:val="24"/>
+        </w:rPr>
+        <w:t xml:space="preserve">Kuznetsova, A., Brockhoff, P. B., &amp; Christensen, R. H. B. (2017). lmerTest package: Tests in linear mixed effects models. </w:t>
       </w:r>
       <w:r>
         <w:rPr>
@@ -8566,25 +8600,15 @@
           <w:sz w:val="24"/>
           <w:szCs w:val="24"/>
         </w:rPr>
-        <w:t xml:space="preserve">Psychological Bulletin, 141</w:t>
-      </w:r>
-      <w:r>
-        <w:rPr>
-          <w:rFonts w:ascii="Times New Roman" w:cs="Times New Roman" w:eastAsia="Times New Roman" w:hAnsi="Times New Roman"/>
-          <w:sz w:val="24"/>
-          <w:szCs w:val="24"/>
-        </w:rPr>
-        <w:t xml:space="preserve">(4), 901–930.</w:t>
-      </w:r>
-      <w:r>
-        <w:rPr>
-          <w:rFonts w:ascii="Times New Roman" w:cs="Times New Roman" w:eastAsia="Times New Roman" w:hAnsi="Times New Roman"/>
-          <w:color w:val="1A56DB"/>
-          <w:sz w:val="24"/>
-          <w:szCs w:val="24"/>
-          <w:u w:val="single"/>
-        </w:rPr>
-        <w:t xml:space="preserve"> https://doi.org/10.1037/a0038822</w:t>
+        <w:t xml:space="preserve">Journal of Statistical Software, 82</w:t>
+      </w:r>
+      <w:r>
+        <w:rPr>
+          <w:rFonts w:ascii="Times New Roman" w:cs="Times New Roman" w:eastAsia="Times New Roman" w:hAnsi="Times New Roman"/>
+          <w:sz w:val="24"/>
+          <w:szCs w:val="24"/>
+        </w:rPr>
+        <w:t xml:space="preserve">(13), 1–26. https://doi.org/10.18637/jss.v082.i13</w:t>
       </w:r>
     </w:p>
     <w:p>
@@ -8598,7 +8622,7 @@
           <w:sz w:val="24"/>
           <w:szCs w:val="24"/>
         </w:rPr>
-        <w:t xml:space="preserve">Jahng, S., Wood, P. K., &amp; Trull, T. J. (2008). Analysis of affective instability in ecological momentary assessment: Indices using successive difference and group comparison via multilevel modeling. </w:t>
+        <w:t xml:space="preserve">Lakens, D. (2017). Equivalence tests: A practical primer for </w:t>
       </w:r>
       <w:r>
         <w:rPr>
@@ -8608,53 +8632,15 @@
           <w:sz w:val="24"/>
           <w:szCs w:val="24"/>
         </w:rPr>
-        <w:t xml:space="preserve">Psychological Methods, 13</w:t>
-      </w:r>
-      <w:r>
-        <w:rPr>
-          <w:rFonts w:ascii="Times New Roman" w:cs="Times New Roman" w:eastAsia="Times New Roman" w:hAnsi="Times New Roman"/>
-          <w:sz w:val="24"/>
-          <w:szCs w:val="24"/>
-        </w:rPr>
-        <w:t xml:space="preserve">(4), 354–375.</w:t>
-      </w:r>
-      <w:r>
-        <w:rPr>
-          <w:rFonts w:ascii="Times New Roman" w:cs="Times New Roman" w:eastAsia="Times New Roman" w:hAnsi="Times New Roman"/>
-          <w:color w:val="1A56DB"/>
-          <w:sz w:val="24"/>
-          <w:szCs w:val="24"/>
-          <w:u w:val="single"/>
-        </w:rPr>
-        <w:t xml:space="preserve"> https://doi.org/10.1037/a0014173</w:t>
-      </w:r>
-    </w:p>
-    <w:p>
-      <w:pPr>
-        <w:spacing w:after="120" w:before="0" w:line="480"/>
-        <w:ind w:left="720" w:hanging="720"/>
-      </w:pPr>
-      <w:r>
-        <w:rPr>
-          <w:rFonts w:ascii="Times New Roman" w:cs="Times New Roman" w:eastAsia="Times New Roman" w:hAnsi="Times New Roman"/>
-          <w:sz w:val="24"/>
-          <w:szCs w:val="24"/>
-        </w:rPr>
-        <w:t xml:space="preserve">Knapen, S. E., Snippe, E., Smit, A. C., Schoevers, R. A., &amp; Riemersma-van der Lek, R. F. (2025). Sleep disturbances in the prodromal phase of mood episodes in patients with bipolar disorder: A replicated single-case design. Journal for Person-Oriented Research, 11(3), 142-168. https://doi.org/10.17505/jpor.2025.28202</w:t>
-      </w:r>
-    </w:p>
-    <w:p>
-      <w:pPr>
-        <w:spacing w:after="120" w:before="0" w:line="480"/>
-        <w:ind w:left="720" w:hanging="720"/>
-      </w:pPr>
-      <w:r>
-        <w:rPr>
-          <w:rFonts w:ascii="Times New Roman" w:cs="Times New Roman" w:eastAsia="Times New Roman" w:hAnsi="Times New Roman"/>
-          <w:sz w:val="24"/>
-          <w:szCs w:val="24"/>
-        </w:rPr>
-        <w:t xml:space="preserve">Koval, P., &amp; Kuppens, P. (2012). Changing emotion dynamics: Individual differences in the effect of anticipatory social stress on emotional inertia. </w:t>
+        <w:t xml:space="preserve">t</w:t>
+      </w:r>
+      <w:r>
+        <w:rPr>
+          <w:rFonts w:ascii="Times New Roman" w:cs="Times New Roman" w:eastAsia="Times New Roman" w:hAnsi="Times New Roman"/>
+          <w:sz w:val="24"/>
+          <w:szCs w:val="24"/>
+        </w:rPr>
+        <w:t xml:space="preserve"> tests, correlations, and meta-analyses. </w:t>
       </w:r>
       <w:r>
         <w:rPr>
@@ -8664,15 +8650,15 @@
           <w:sz w:val="24"/>
           <w:szCs w:val="24"/>
         </w:rPr>
-        <w:t xml:space="preserve">Emotion, 12</w:t>
-      </w:r>
-      <w:r>
-        <w:rPr>
-          <w:rFonts w:ascii="Times New Roman" w:cs="Times New Roman" w:eastAsia="Times New Roman" w:hAnsi="Times New Roman"/>
-          <w:sz w:val="24"/>
-          <w:szCs w:val="24"/>
-        </w:rPr>
-        <w:t xml:space="preserve">(2), 256–267.</w:t>
+        <w:t xml:space="preserve">Social Psychological and Personality Science, 8</w:t>
+      </w:r>
+      <w:r>
+        <w:rPr>
+          <w:rFonts w:ascii="Times New Roman" w:cs="Times New Roman" w:eastAsia="Times New Roman" w:hAnsi="Times New Roman"/>
+          <w:sz w:val="24"/>
+          <w:szCs w:val="24"/>
+        </w:rPr>
+        <w:t xml:space="preserve">(4), 355–362.</w:t>
       </w:r>
       <w:r>
         <w:rPr>
@@ -8682,7 +8668,7 @@
           <w:szCs w:val="24"/>
           <w:u w:val="single"/>
         </w:rPr>
-        <w:t xml:space="preserve"> https://doi.org/10.1037/a0024756</w:t>
+        <w:t xml:space="preserve"> https://doi.org/10.1177/1948550617697177</w:t>
       </w:r>
     </w:p>
     <w:p>
@@ -8696,7 +8682,7 @@
           <w:sz w:val="24"/>
           <w:szCs w:val="24"/>
         </w:rPr>
-        <w:t xml:space="preserve">Kuppens, P., Allen, N. B., &amp; Sheeber, L. B. (2010). Emotional inertia and psychological maladjustment. </w:t>
+        <w:t xml:space="preserve">Lazarus, R. S. (1991). </w:t>
       </w:r>
       <w:r>
         <w:rPr>
@@ -8706,39 +8692,29 @@
           <w:sz w:val="24"/>
           <w:szCs w:val="24"/>
         </w:rPr>
-        <w:t xml:space="preserve">Psychological Science, 21</w:t>
-      </w:r>
-      <w:r>
-        <w:rPr>
-          <w:rFonts w:ascii="Times New Roman" w:cs="Times New Roman" w:eastAsia="Times New Roman" w:hAnsi="Times New Roman"/>
-          <w:sz w:val="24"/>
-          <w:szCs w:val="24"/>
-        </w:rPr>
-        <w:t xml:space="preserve">(7), 984–991.</w:t>
-      </w:r>
-      <w:r>
-        <w:rPr>
-          <w:rFonts w:ascii="Times New Roman" w:cs="Times New Roman" w:eastAsia="Times New Roman" w:hAnsi="Times New Roman"/>
-          <w:color w:val="1A56DB"/>
-          <w:sz w:val="24"/>
-          <w:szCs w:val="24"/>
-          <w:u w:val="single"/>
-        </w:rPr>
-        <w:t xml:space="preserve"> https://doi.org/10.1177/0956797610372634</w:t>
-      </w:r>
-    </w:p>
-    <w:p>
-      <w:pPr>
-        <w:spacing w:after="120" w:before="0" w:line="480"/>
-        <w:jc w:val="both"/>
-      </w:pPr>
-      <w:r>
-        <w:rPr>
-          <w:rFonts w:ascii="Times New Roman" w:cs="Times New Roman" w:eastAsia="Times New Roman" w:hAnsi="Times New Roman"/>
-          <w:sz w:val="24"/>
-          <w:szCs w:val="24"/>
-        </w:rPr>
-        <w:t xml:space="preserve">Kuznetsova, A., Brockhoff, P. B., &amp; Christensen, R. H. B. (2017). lmerTest package: Tests in linear mixed effects models. </w:t>
+        <w:t xml:space="preserve">Emotion and adaptation</w:t>
+      </w:r>
+      <w:r>
+        <w:rPr>
+          <w:rFonts w:ascii="Times New Roman" w:cs="Times New Roman" w:eastAsia="Times New Roman" w:hAnsi="Times New Roman"/>
+          <w:sz w:val="24"/>
+          <w:szCs w:val="24"/>
+        </w:rPr>
+        <w:t xml:space="preserve">. Oxford University Press.</w:t>
+      </w:r>
+    </w:p>
+    <w:p>
+      <w:pPr>
+        <w:spacing w:after="120" w:before="0" w:line="480"/>
+        <w:ind w:left="720" w:hanging="720"/>
+      </w:pPr>
+      <w:r>
+        <w:rPr>
+          <w:rFonts w:ascii="Times New Roman" w:cs="Times New Roman" w:eastAsia="Times New Roman" w:hAnsi="Times New Roman"/>
+          <w:sz w:val="24"/>
+          <w:szCs w:val="24"/>
+        </w:rPr>
+        <w:t xml:space="preserve">Metcalfe, J., &amp; Greene, M. J. (2007). Metacognition of agency. </w:t>
       </w:r>
       <w:r>
         <w:rPr>
@@ -8748,15 +8724,25 @@
           <w:sz w:val="24"/>
           <w:szCs w:val="24"/>
         </w:rPr>
-        <w:t xml:space="preserve">Journal of Statistical Software, 82</w:t>
-      </w:r>
-      <w:r>
-        <w:rPr>
-          <w:rFonts w:ascii="Times New Roman" w:cs="Times New Roman" w:eastAsia="Times New Roman" w:hAnsi="Times New Roman"/>
-          <w:sz w:val="24"/>
-          <w:szCs w:val="24"/>
-        </w:rPr>
-        <w:t xml:space="preserve">(13), 1–26. https://doi.org/10.18637/jss.v082.i13</w:t>
+        <w:t xml:space="preserve">Journal of Experimental Psychology: General, 136</w:t>
+      </w:r>
+      <w:r>
+        <w:rPr>
+          <w:rFonts w:ascii="Times New Roman" w:cs="Times New Roman" w:eastAsia="Times New Roman" w:hAnsi="Times New Roman"/>
+          <w:sz w:val="24"/>
+          <w:szCs w:val="24"/>
+        </w:rPr>
+        <w:t xml:space="preserve">(2), 184–199.</w:t>
+      </w:r>
+      <w:r>
+        <w:rPr>
+          <w:rFonts w:ascii="Times New Roman" w:cs="Times New Roman" w:eastAsia="Times New Roman" w:hAnsi="Times New Roman"/>
+          <w:color w:val="1A56DB"/>
+          <w:sz w:val="24"/>
+          <w:szCs w:val="24"/>
+          <w:u w:val="single"/>
+        </w:rPr>
+        <w:t xml:space="preserve"> https://doi.org/10.1037/0096-3445.136.2.184</w:t>
       </w:r>
     </w:p>
     <w:p>
@@ -8770,7 +8756,7 @@
           <w:sz w:val="24"/>
           <w:szCs w:val="24"/>
         </w:rPr>
-        <w:t xml:space="preserve">Lakens, D. (2017). Equivalence tests: A practical primer for </w:t>
+        <w:t xml:space="preserve">Molenaar, P. C. M. (2004). A manifesto on psychology as idiographic science: Bringing the person back into scientific psychology, this time forever. </w:t>
       </w:r>
       <w:r>
         <w:rPr>
@@ -8780,15 +8766,39 @@
           <w:sz w:val="24"/>
           <w:szCs w:val="24"/>
         </w:rPr>
-        <w:t xml:space="preserve">t</w:t>
-      </w:r>
-      <w:r>
-        <w:rPr>
-          <w:rFonts w:ascii="Times New Roman" w:cs="Times New Roman" w:eastAsia="Times New Roman" w:hAnsi="Times New Roman"/>
-          <w:sz w:val="24"/>
-          <w:szCs w:val="24"/>
-        </w:rPr>
-        <w:t xml:space="preserve"> tests, correlations, and meta-analyses. </w:t>
+        <w:t xml:space="preserve">Measurement: Interdisciplinary Research and Perspectives, 2</w:t>
+      </w:r>
+      <w:r>
+        <w:rPr>
+          <w:rFonts w:ascii="Times New Roman" w:cs="Times New Roman" w:eastAsia="Times New Roman" w:hAnsi="Times New Roman"/>
+          <w:sz w:val="24"/>
+          <w:szCs w:val="24"/>
+        </w:rPr>
+        <w:t xml:space="preserve">(4), 201–218.</w:t>
+      </w:r>
+      <w:r>
+        <w:rPr>
+          <w:rFonts w:ascii="Times New Roman" w:cs="Times New Roman" w:eastAsia="Times New Roman" w:hAnsi="Times New Roman"/>
+          <w:color w:val="1A56DB"/>
+          <w:sz w:val="24"/>
+          <w:szCs w:val="24"/>
+          <w:u w:val="single"/>
+        </w:rPr>
+        <w:t xml:space="preserve"> https://doi.org/10.1207/s15366359mea0204_1</w:t>
+      </w:r>
+    </w:p>
+    <w:p>
+      <w:pPr>
+        <w:spacing w:after="120" w:before="0" w:line="480"/>
+        <w:ind w:left="720" w:hanging="720"/>
+      </w:pPr>
+      <w:r>
+        <w:rPr>
+          <w:rFonts w:ascii="Times New Roman" w:cs="Times New Roman" w:eastAsia="Times New Roman" w:hAnsi="Times New Roman"/>
+          <w:sz w:val="24"/>
+          <w:szCs w:val="24"/>
+        </w:rPr>
+        <w:t xml:space="preserve">Molenaar, P. C. M., &amp; Campbell, C. G. (2009). The new person-specific paradigm in psychology. </w:t>
       </w:r>
       <w:r>
         <w:rPr>
@@ -8798,15 +8808,15 @@
           <w:sz w:val="24"/>
           <w:szCs w:val="24"/>
         </w:rPr>
-        <w:t xml:space="preserve">Social Psychological and Personality Science, 8</w:t>
-      </w:r>
-      <w:r>
-        <w:rPr>
-          <w:rFonts w:ascii="Times New Roman" w:cs="Times New Roman" w:eastAsia="Times New Roman" w:hAnsi="Times New Roman"/>
-          <w:sz w:val="24"/>
-          <w:szCs w:val="24"/>
-        </w:rPr>
-        <w:t xml:space="preserve">(4), 355–362.</w:t>
+        <w:t xml:space="preserve">Current Directions in Psychological Science, 18</w:t>
+      </w:r>
+      <w:r>
+        <w:rPr>
+          <w:rFonts w:ascii="Times New Roman" w:cs="Times New Roman" w:eastAsia="Times New Roman" w:hAnsi="Times New Roman"/>
+          <w:sz w:val="24"/>
+          <w:szCs w:val="24"/>
+        </w:rPr>
+        <w:t xml:space="preserve">(2), 112–117.</w:t>
       </w:r>
       <w:r>
         <w:rPr>
@@ -8816,7 +8826,7 @@
           <w:szCs w:val="24"/>
           <w:u w:val="single"/>
         </w:rPr>
-        <w:t xml:space="preserve"> https://doi.org/10.1177/1948550617697177</w:t>
+        <w:t xml:space="preserve"> https://doi.org/10.1111/j.1467-8721.2009.01619.x</w:t>
       </w:r>
     </w:p>
     <w:p>
@@ -8830,7 +8840,7 @@
           <w:sz w:val="24"/>
           <w:szCs w:val="24"/>
         </w:rPr>
-        <w:t xml:space="preserve">Lazarus, R. S. (1991). </w:t>
+        <w:t xml:space="preserve">Myin-Germeys, I., &amp; Kuppens, P. (Eds.). (2022). </w:t>
       </w:r>
       <w:r>
         <w:rPr>
@@ -8840,15 +8850,15 @@
           <w:sz w:val="24"/>
           <w:szCs w:val="24"/>
         </w:rPr>
-        <w:t xml:space="preserve">Emotion and adaptation</w:t>
-      </w:r>
-      <w:r>
-        <w:rPr>
-          <w:rFonts w:ascii="Times New Roman" w:cs="Times New Roman" w:eastAsia="Times New Roman" w:hAnsi="Times New Roman"/>
-          <w:sz w:val="24"/>
-          <w:szCs w:val="24"/>
-        </w:rPr>
-        <w:t xml:space="preserve">. Oxford University Press.</w:t>
+        <w:t xml:space="preserve">The open handbook of experience sampling methodology</w:t>
+      </w:r>
+      <w:r>
+        <w:rPr>
+          <w:rFonts w:ascii="Times New Roman" w:cs="Times New Roman" w:eastAsia="Times New Roman" w:hAnsi="Times New Roman"/>
+          <w:sz w:val="24"/>
+          <w:szCs w:val="24"/>
+        </w:rPr>
+        <w:t xml:space="preserve"> (2nd ed.). Center for Research on Experience Sampling and Ambulatory Methods Leuven.</w:t>
       </w:r>
     </w:p>
     <w:p>
@@ -8862,7 +8872,7 @@
           <w:sz w:val="24"/>
           <w:szCs w:val="24"/>
         </w:rPr>
-        <w:t xml:space="preserve">Metcalfe, J., &amp; Greene, M. J. (2007). Metacognition of agency. </w:t>
+        <w:t xml:space="preserve">Nelson, T. O., &amp; Narens, L. (1990). Metamemory: A theoretical framework and new findings. In G. H. Bower (Ed.), </w:t>
       </w:r>
       <w:r>
         <w:rPr>
@@ -8872,25 +8882,15 @@
           <w:sz w:val="24"/>
           <w:szCs w:val="24"/>
         </w:rPr>
-        <w:t xml:space="preserve">Journal of Experimental Psychology: General, 136</w:t>
-      </w:r>
-      <w:r>
-        <w:rPr>
-          <w:rFonts w:ascii="Times New Roman" w:cs="Times New Roman" w:eastAsia="Times New Roman" w:hAnsi="Times New Roman"/>
-          <w:sz w:val="24"/>
-          <w:szCs w:val="24"/>
-        </w:rPr>
-        <w:t xml:space="preserve">(2), 184–199.</w:t>
-      </w:r>
-      <w:r>
-        <w:rPr>
-          <w:rFonts w:ascii="Times New Roman" w:cs="Times New Roman" w:eastAsia="Times New Roman" w:hAnsi="Times New Roman"/>
-          <w:color w:val="1A56DB"/>
-          <w:sz w:val="24"/>
-          <w:szCs w:val="24"/>
-          <w:u w:val="single"/>
-        </w:rPr>
-        <w:t xml:space="preserve"> https://doi.org/10.1037/0096-3445.136.2.184</w:t>
+        <w:t xml:space="preserve">The psychology of learning and motivation</w:t>
+      </w:r>
+      <w:r>
+        <w:rPr>
+          <w:rFonts w:ascii="Times New Roman" w:cs="Times New Roman" w:eastAsia="Times New Roman" w:hAnsi="Times New Roman"/>
+          <w:sz w:val="24"/>
+          <w:szCs w:val="24"/>
+        </w:rPr>
+        <w:t xml:space="preserve"> (Vol. 26, pp. 125–173). Academic Press.</w:t>
       </w:r>
     </w:p>
     <w:p>
@@ -8904,7 +8904,7 @@
           <w:sz w:val="24"/>
           <w:szCs w:val="24"/>
         </w:rPr>
-        <w:t xml:space="preserve">Molenaar, P. C. M. (2004). A manifesto on psychology as idiographic science: Bringing the person back into scientific psychology, this time forever. </w:t>
+        <w:t xml:space="preserve">Olthof, M., Hasselman, F., Strunk, G., van Rooij, M., Aas, B., Helmich, M. A., Schiepek, G., &amp; Lichtwarck-Aschoff, A. (2020). Critical fluctuations as an early-warning signal for sudden gains and losses in patients receiving psychotherapy for mood disorders. </w:t>
       </w:r>
       <w:r>
         <w:rPr>
@@ -8914,15 +8914,15 @@
           <w:sz w:val="24"/>
           <w:szCs w:val="24"/>
         </w:rPr>
-        <w:t xml:space="preserve">Measurement: Interdisciplinary Research and Perspectives, 2</w:t>
-      </w:r>
-      <w:r>
-        <w:rPr>
-          <w:rFonts w:ascii="Times New Roman" w:cs="Times New Roman" w:eastAsia="Times New Roman" w:hAnsi="Times New Roman"/>
-          <w:sz w:val="24"/>
-          <w:szCs w:val="24"/>
-        </w:rPr>
-        <w:t xml:space="preserve">(4), 201–218.</w:t>
+        <w:t xml:space="preserve">Clinical Psychological Science, 8</w:t>
+      </w:r>
+      <w:r>
+        <w:rPr>
+          <w:rFonts w:ascii="Times New Roman" w:cs="Times New Roman" w:eastAsia="Times New Roman" w:hAnsi="Times New Roman"/>
+          <w:sz w:val="24"/>
+          <w:szCs w:val="24"/>
+        </w:rPr>
+        <w:t xml:space="preserve">(1), 25–35.</w:t>
       </w:r>
       <w:r>
         <w:rPr>
@@ -8932,7 +8932,7 @@
           <w:szCs w:val="24"/>
           <w:u w:val="single"/>
         </w:rPr>
-        <w:t xml:space="preserve"> https://doi.org/10.1207/s15366359mea0204_1</w:t>
+        <w:t xml:space="preserve"> https://doi.org/10.1177/2167702619865969</w:t>
       </w:r>
     </w:p>
     <w:p>
@@ -8946,7 +8946,7 @@
           <w:sz w:val="24"/>
           <w:szCs w:val="24"/>
         </w:rPr>
-        <w:t xml:space="preserve">Molenaar, P. C. M., &amp; Campbell, C. G. (2009). The new person-specific paradigm in psychology. </w:t>
+        <w:t xml:space="preserve">Russell, J. A. (1980). A circumplex model of affect. </w:t>
       </w:r>
       <w:r>
         <w:rPr>
@@ -8956,15 +8956,15 @@
           <w:sz w:val="24"/>
           <w:szCs w:val="24"/>
         </w:rPr>
-        <w:t xml:space="preserve">Current Directions in Psychological Science, 18</w:t>
-      </w:r>
-      <w:r>
-        <w:rPr>
-          <w:rFonts w:ascii="Times New Roman" w:cs="Times New Roman" w:eastAsia="Times New Roman" w:hAnsi="Times New Roman"/>
-          <w:sz w:val="24"/>
-          <w:szCs w:val="24"/>
-        </w:rPr>
-        <w:t xml:space="preserve">(2), 112–117.</w:t>
+        <w:t xml:space="preserve">Journal of Personality and Social Psychology, 39</w:t>
+      </w:r>
+      <w:r>
+        <w:rPr>
+          <w:rFonts w:ascii="Times New Roman" w:cs="Times New Roman" w:eastAsia="Times New Roman" w:hAnsi="Times New Roman"/>
+          <w:sz w:val="24"/>
+          <w:szCs w:val="24"/>
+        </w:rPr>
+        <w:t xml:space="preserve">(6), 1161–1178.</w:t>
       </w:r>
       <w:r>
         <w:rPr>
@@ -8974,7 +8974,7 @@
           <w:szCs w:val="24"/>
           <w:u w:val="single"/>
         </w:rPr>
-        <w:t xml:space="preserve"> https://doi.org/10.1111/j.1467-8721.2009.01619.x</w:t>
+        <w:t xml:space="preserve"> https://doi.org/10.1037/h0077714</w:t>
       </w:r>
     </w:p>
     <w:p>
@@ -8988,7 +8988,7 @@
           <w:sz w:val="24"/>
           <w:szCs w:val="24"/>
         </w:rPr>
-        <w:t xml:space="preserve">Moore, J. W., &amp; Fletcher, P. C. (2012). Sense of agency in health and disease: A review of cue integration approaches. </w:t>
+        <w:t xml:space="preserve">Russell, J. A., &amp; Barrett, L. F. (1999). Core affect, prototypical emotional episodes, and other things called emotion: Dissecting the elephant. </w:t>
       </w:r>
       <w:r>
         <w:rPr>
@@ -8998,15 +8998,15 @@
           <w:sz w:val="24"/>
           <w:szCs w:val="24"/>
         </w:rPr>
-        <w:t xml:space="preserve">Consciousness and Cognition, 21</w:t>
-      </w:r>
-      <w:r>
-        <w:rPr>
-          <w:rFonts w:ascii="Times New Roman" w:cs="Times New Roman" w:eastAsia="Times New Roman" w:hAnsi="Times New Roman"/>
-          <w:sz w:val="24"/>
-          <w:szCs w:val="24"/>
-        </w:rPr>
-        <w:t xml:space="preserve">(1), 59–68.</w:t>
+        <w:t xml:space="preserve">Journal of Personality and Social Psychology, 76</w:t>
+      </w:r>
+      <w:r>
+        <w:rPr>
+          <w:rFonts w:ascii="Times New Roman" w:cs="Times New Roman" w:eastAsia="Times New Roman" w:hAnsi="Times New Roman"/>
+          <w:sz w:val="24"/>
+          <w:szCs w:val="24"/>
+        </w:rPr>
+        <w:t xml:space="preserve">(5), 805–819.</w:t>
       </w:r>
       <w:r>
         <w:rPr>
@@ -9016,7 +9016,7 @@
           <w:szCs w:val="24"/>
           <w:u w:val="single"/>
         </w:rPr>
-        <w:t xml:space="preserve"> https://doi.org/10.1016/j.concog.2011.08.010</w:t>
+        <w:t xml:space="preserve"> https://doi.org/10.1037/0022-3514.76.5.805</w:t>
       </w:r>
     </w:p>
     <w:p>
@@ -9030,7 +9030,7 @@
           <w:sz w:val="24"/>
           <w:szCs w:val="24"/>
         </w:rPr>
-        <w:t xml:space="preserve">Myin-Germeys, I., &amp; Kuppens, P. (Eds.). (2022). </w:t>
+        <w:t xml:space="preserve">Ryan, R. M., &amp; Deci, E. L. (2017). </w:t>
       </w:r>
       <w:r>
         <w:rPr>
@@ -9040,15 +9040,15 @@
           <w:sz w:val="24"/>
           <w:szCs w:val="24"/>
         </w:rPr>
-        <w:t xml:space="preserve">The open handbook of experience sampling methodology</w:t>
-      </w:r>
-      <w:r>
-        <w:rPr>
-          <w:rFonts w:ascii="Times New Roman" w:cs="Times New Roman" w:eastAsia="Times New Roman" w:hAnsi="Times New Roman"/>
-          <w:sz w:val="24"/>
-          <w:szCs w:val="24"/>
-        </w:rPr>
-        <w:t xml:space="preserve"> (2nd ed.). Center for Research on Experience Sampling and Ambulatory Methods Leuven.</w:t>
+        <w:t xml:space="preserve">Self-determination theory: Basic psychological needs in motivation, development, and wellness</w:t>
+      </w:r>
+      <w:r>
+        <w:rPr>
+          <w:rFonts w:ascii="Times New Roman" w:cs="Times New Roman" w:eastAsia="Times New Roman" w:hAnsi="Times New Roman"/>
+          <w:sz w:val="24"/>
+          <w:szCs w:val="24"/>
+        </w:rPr>
+        <w:t xml:space="preserve">. Guilford Press.</w:t>
       </w:r>
     </w:p>
     <w:p>
@@ -9062,7 +9062,7 @@
           <w:sz w:val="24"/>
           <w:szCs w:val="24"/>
         </w:rPr>
-        <w:t xml:space="preserve">Nelson, T. O., &amp; Narens, L. (1990). Metamemory: A theoretical framework and new findings. In G. H. Bower (Ed.), </w:t>
+        <w:t xml:space="preserve">Seabold, S., &amp; Perktold, J. (2010). statsmodels: Econometric and statistical modeling with Python. In </w:t>
       </w:r>
       <w:r>
         <w:rPr>
@@ -9072,15 +9072,15 @@
           <w:sz w:val="24"/>
           <w:szCs w:val="24"/>
         </w:rPr>
-        <w:t xml:space="preserve">The psychology of learning and motivation</w:t>
-      </w:r>
-      <w:r>
-        <w:rPr>
-          <w:rFonts w:ascii="Times New Roman" w:cs="Times New Roman" w:eastAsia="Times New Roman" w:hAnsi="Times New Roman"/>
-          <w:sz w:val="24"/>
-          <w:szCs w:val="24"/>
-        </w:rPr>
-        <w:t xml:space="preserve"> (Vol. 26, pp. 125–173). Academic Press.</w:t>
+        <w:t xml:space="preserve">Proceedings of the 9th Python in Science Conference</w:t>
+      </w:r>
+      <w:r>
+        <w:rPr>
+          <w:rFonts w:ascii="Times New Roman" w:cs="Times New Roman" w:eastAsia="Times New Roman" w:hAnsi="Times New Roman"/>
+          <w:sz w:val="24"/>
+          <w:szCs w:val="24"/>
+        </w:rPr>
+        <w:t xml:space="preserve"> (pp. 92–96).</w:t>
       </w:r>
     </w:p>
     <w:p>
@@ -9094,7 +9094,21 @@
           <w:sz w:val="24"/>
           <w:szCs w:val="24"/>
         </w:rPr>
-        <w:t xml:space="preserve">Olthof, M., Hasselman, F., Strunk, G., van Rooij, M., Aas, B., Helmich, M. A., Schiepek, G., &amp; Lichtwarck-Aschoff, A. (2020). Critical fluctuations as an early-warning signal for sudden gains and losses in patients receiving psychotherapy for mood disorders. </w:t>
+        <w:t xml:space="preserve">Smit, A. C., Snippe, E., Bringmann, L. F., Hoenders, H. J. R., &amp; Wichers, M. (2023). Transitions in depression: If, how, and when depressive symptoms return during and after discontinuing antidepressants. Quality of Life Research, 32(5), 1295-1306. https://doi.org/10.1007/s11136-022-03301-0</w:t>
+      </w:r>
+    </w:p>
+    <w:p>
+      <w:pPr>
+        <w:spacing w:after="120" w:before="0" w:line="480"/>
+        <w:ind w:left="720" w:hanging="720"/>
+      </w:pPr>
+      <w:r>
+        <w:rPr>
+          <w:rFonts w:ascii="Times New Roman" w:cs="Times New Roman" w:eastAsia="Times New Roman" w:hAnsi="Times New Roman"/>
+          <w:sz w:val="24"/>
+          <w:szCs w:val="24"/>
+        </w:rPr>
+        <w:t xml:space="preserve">Synofzik, M., Vosgerau, G., &amp; Newen, A. (2008). Beyond the comparator model: A multifactorial two-step account of agency. </w:t>
       </w:r>
       <w:r>
         <w:rPr>
@@ -9104,15 +9118,15 @@
           <w:sz w:val="24"/>
           <w:szCs w:val="24"/>
         </w:rPr>
-        <w:t xml:space="preserve">Clinical Psychological Science, 8</w:t>
-      </w:r>
-      <w:r>
-        <w:rPr>
-          <w:rFonts w:ascii="Times New Roman" w:cs="Times New Roman" w:eastAsia="Times New Roman" w:hAnsi="Times New Roman"/>
-          <w:sz w:val="24"/>
-          <w:szCs w:val="24"/>
-        </w:rPr>
-        <w:t xml:space="preserve">(1), 25–35.</w:t>
+        <w:t xml:space="preserve">Consciousness and Cognition, 17</w:t>
+      </w:r>
+      <w:r>
+        <w:rPr>
+          <w:rFonts w:ascii="Times New Roman" w:cs="Times New Roman" w:eastAsia="Times New Roman" w:hAnsi="Times New Roman"/>
+          <w:sz w:val="24"/>
+          <w:szCs w:val="24"/>
+        </w:rPr>
+        <w:t xml:space="preserve">(1), 219–239.</w:t>
       </w:r>
       <w:r>
         <w:rPr>
@@ -9122,295 +9136,7 @@
           <w:szCs w:val="24"/>
           <w:u w:val="single"/>
         </w:rPr>
-        <w:t xml:space="preserve"> https://doi.org/10.1177/2167702619865969</w:t>
-      </w:r>
-    </w:p>
-    <w:p>
-      <w:pPr>
-        <w:spacing w:after="120" w:before="0" w:line="480"/>
-        <w:ind w:left="720" w:hanging="720"/>
-      </w:pPr>
-      <w:r>
-        <w:rPr>
-          <w:rFonts w:ascii="Times New Roman" w:cs="Times New Roman" w:eastAsia="Times New Roman" w:hAnsi="Times New Roman"/>
-          <w:sz w:val="24"/>
-          <w:szCs w:val="24"/>
-        </w:rPr>
-        <w:t xml:space="preserve">Russell, J. A. (1980). A circumplex model of affect. </w:t>
-      </w:r>
-      <w:r>
-        <w:rPr>
-          <w:rFonts w:ascii="Times New Roman" w:cs="Times New Roman" w:eastAsia="Times New Roman" w:hAnsi="Times New Roman"/>
-          <w:i/>
-          <w:iCs/>
-          <w:sz w:val="24"/>
-          <w:szCs w:val="24"/>
-        </w:rPr>
-        <w:t xml:space="preserve">Journal of Personality and Social Psychology, 39</w:t>
-      </w:r>
-      <w:r>
-        <w:rPr>
-          <w:rFonts w:ascii="Times New Roman" w:cs="Times New Roman" w:eastAsia="Times New Roman" w:hAnsi="Times New Roman"/>
-          <w:sz w:val="24"/>
-          <w:szCs w:val="24"/>
-        </w:rPr>
-        <w:t xml:space="preserve">(6), 1161–1178.</w:t>
-      </w:r>
-      <w:r>
-        <w:rPr>
-          <w:rFonts w:ascii="Times New Roman" w:cs="Times New Roman" w:eastAsia="Times New Roman" w:hAnsi="Times New Roman"/>
-          <w:color w:val="1A56DB"/>
-          <w:sz w:val="24"/>
-          <w:szCs w:val="24"/>
-          <w:u w:val="single"/>
-        </w:rPr>
-        <w:t xml:space="preserve"> https://doi.org/10.1037/h0077714</w:t>
-      </w:r>
-    </w:p>
-    <w:p>
-      <w:pPr>
-        <w:spacing w:after="120" w:before="0" w:line="480"/>
-        <w:ind w:left="720" w:hanging="720"/>
-      </w:pPr>
-      <w:r>
-        <w:rPr>
-          <w:rFonts w:ascii="Times New Roman" w:cs="Times New Roman" w:eastAsia="Times New Roman" w:hAnsi="Times New Roman"/>
-          <w:sz w:val="24"/>
-          <w:szCs w:val="24"/>
-        </w:rPr>
-        <w:t xml:space="preserve">Russell, J. A., &amp; Barrett, L. F. (1999). Core affect, prototypical emotional episodes, and other things called emotion: Dissecting the elephant. </w:t>
-      </w:r>
-      <w:r>
-        <w:rPr>
-          <w:rFonts w:ascii="Times New Roman" w:cs="Times New Roman" w:eastAsia="Times New Roman" w:hAnsi="Times New Roman"/>
-          <w:i/>
-          <w:iCs/>
-          <w:sz w:val="24"/>
-          <w:szCs w:val="24"/>
-        </w:rPr>
-        <w:t xml:space="preserve">Journal of Personality and Social Psychology, 76</w:t>
-      </w:r>
-      <w:r>
-        <w:rPr>
-          <w:rFonts w:ascii="Times New Roman" w:cs="Times New Roman" w:eastAsia="Times New Roman" w:hAnsi="Times New Roman"/>
-          <w:sz w:val="24"/>
-          <w:szCs w:val="24"/>
-        </w:rPr>
-        <w:t xml:space="preserve">(5), 805–819.</w:t>
-      </w:r>
-      <w:r>
-        <w:rPr>
-          <w:rFonts w:ascii="Times New Roman" w:cs="Times New Roman" w:eastAsia="Times New Roman" w:hAnsi="Times New Roman"/>
-          <w:color w:val="1A56DB"/>
-          <w:sz w:val="24"/>
-          <w:szCs w:val="24"/>
-          <w:u w:val="single"/>
-        </w:rPr>
-        <w:t xml:space="preserve"> https://doi.org/10.1037/0022-3514.76.5.805</w:t>
-      </w:r>
-    </w:p>
-    <w:p>
-      <w:pPr>
-        <w:spacing w:after="120" w:before="0" w:line="480"/>
-        <w:ind w:left="720" w:hanging="720"/>
-      </w:pPr>
-      <w:r>
-        <w:rPr>
-          <w:rFonts w:ascii="Times New Roman" w:cs="Times New Roman" w:eastAsia="Times New Roman" w:hAnsi="Times New Roman"/>
-          <w:sz w:val="24"/>
-          <w:szCs w:val="24"/>
-        </w:rPr>
-        <w:t xml:space="preserve">Ryan, R. M., &amp; Deci, E. L. (2017). </w:t>
-      </w:r>
-      <w:r>
-        <w:rPr>
-          <w:rFonts w:ascii="Times New Roman" w:cs="Times New Roman" w:eastAsia="Times New Roman" w:hAnsi="Times New Roman"/>
-          <w:i/>
-          <w:iCs/>
-          <w:sz w:val="24"/>
-          <w:szCs w:val="24"/>
-        </w:rPr>
-        <w:t xml:space="preserve">Self-determination theory: Basic psychological needs in motivation, development, and wellness</w:t>
-      </w:r>
-      <w:r>
-        <w:rPr>
-          <w:rFonts w:ascii="Times New Roman" w:cs="Times New Roman" w:eastAsia="Times New Roman" w:hAnsi="Times New Roman"/>
-          <w:sz w:val="24"/>
-          <w:szCs w:val="24"/>
-        </w:rPr>
-        <w:t xml:space="preserve">. Guilford Press.</w:t>
-      </w:r>
-    </w:p>
-    <w:p>
-      <w:pPr>
-        <w:spacing w:after="120" w:before="0" w:line="480"/>
-        <w:ind w:left="720" w:hanging="720"/>
-      </w:pPr>
-      <w:r>
-        <w:rPr>
-          <w:rFonts w:ascii="Times New Roman" w:cs="Times New Roman" w:eastAsia="Times New Roman" w:hAnsi="Times New Roman"/>
-          <w:sz w:val="24"/>
-          <w:szCs w:val="24"/>
-        </w:rPr>
-        <w:t xml:space="preserve">Schraw, G., &amp; Moshman, D. (1995). Metacognitive theories. </w:t>
-      </w:r>
-      <w:r>
-        <w:rPr>
-          <w:rFonts w:ascii="Times New Roman" w:cs="Times New Roman" w:eastAsia="Times New Roman" w:hAnsi="Times New Roman"/>
-          <w:i/>
-          <w:iCs/>
-          <w:sz w:val="24"/>
-          <w:szCs w:val="24"/>
-        </w:rPr>
-        <w:t xml:space="preserve">Educational Psychology Review, 7</w:t>
-      </w:r>
-      <w:r>
-        <w:rPr>
-          <w:rFonts w:ascii="Times New Roman" w:cs="Times New Roman" w:eastAsia="Times New Roman" w:hAnsi="Times New Roman"/>
-          <w:sz w:val="24"/>
-          <w:szCs w:val="24"/>
-        </w:rPr>
-        <w:t xml:space="preserve">(4), 351–371.</w:t>
-      </w:r>
-      <w:r>
-        <w:rPr>
-          <w:rFonts w:ascii="Times New Roman" w:cs="Times New Roman" w:eastAsia="Times New Roman" w:hAnsi="Times New Roman"/>
-          <w:color w:val="1A56DB"/>
-          <w:sz w:val="24"/>
-          <w:szCs w:val="24"/>
-          <w:u w:val="single"/>
-        </w:rPr>
-        <w:t xml:space="preserve"> https://doi.org/10.1007/BF02212307</w:t>
-      </w:r>
-    </w:p>
-    <w:p>
-      <w:pPr>
-        <w:spacing w:after="120" w:before="0" w:line="480"/>
-        <w:ind w:left="720" w:hanging="720"/>
-      </w:pPr>
-      <w:r>
-        <w:rPr>
-          <w:rFonts w:ascii="Times New Roman" w:cs="Times New Roman" w:eastAsia="Times New Roman" w:hAnsi="Times New Roman"/>
-          <w:sz w:val="24"/>
-          <w:szCs w:val="24"/>
-        </w:rPr>
-        <w:t xml:space="preserve">Seabold, S., &amp; Perktold, J. (2010). statsmodels: Econometric and statistical modeling with Python. In </w:t>
-      </w:r>
-      <w:r>
-        <w:rPr>
-          <w:rFonts w:ascii="Times New Roman" w:cs="Times New Roman" w:eastAsia="Times New Roman" w:hAnsi="Times New Roman"/>
-          <w:i/>
-          <w:iCs/>
-          <w:sz w:val="24"/>
-          <w:szCs w:val="24"/>
-        </w:rPr>
-        <w:t xml:space="preserve">Proceedings of the 9th Python in Science Conference</w:t>
-      </w:r>
-      <w:r>
-        <w:rPr>
-          <w:rFonts w:ascii="Times New Roman" w:cs="Times New Roman" w:eastAsia="Times New Roman" w:hAnsi="Times New Roman"/>
-          <w:sz w:val="24"/>
-          <w:szCs w:val="24"/>
-        </w:rPr>
-        <w:t xml:space="preserve"> (pp. 92–96).</w:t>
-      </w:r>
-    </w:p>
-    <w:p>
-      <w:pPr>
-        <w:spacing w:after="120" w:before="0" w:line="480"/>
-        <w:ind w:left="720" w:hanging="720"/>
-      </w:pPr>
-      <w:r>
-        <w:rPr>
-          <w:rFonts w:ascii="Times New Roman" w:cs="Times New Roman" w:eastAsia="Times New Roman" w:hAnsi="Times New Roman"/>
-          <w:sz w:val="24"/>
-          <w:szCs w:val="24"/>
-        </w:rPr>
-        <w:t xml:space="preserve">Smit, A. C., Snippe, E., Bringmann, L. F., Hoenders, H. J. R., &amp; Wichers, M. (2023). Transitions in depression: If, how, and when depressive symptoms return during and after discontinuing antidepressants. Quality of Life Research, 32(5), 1295-1306. https://doi.org/10.1007/s11136-022-03301-0</w:t>
-      </w:r>
-    </w:p>
-    <w:p>
-      <w:pPr>
-        <w:spacing w:after="120" w:before="0" w:line="480"/>
-        <w:ind w:left="720" w:hanging="720"/>
-      </w:pPr>
-      <w:r>
-        <w:rPr>
-          <w:rFonts w:ascii="Times New Roman" w:cs="Times New Roman" w:eastAsia="Times New Roman" w:hAnsi="Times New Roman"/>
-          <w:sz w:val="24"/>
-          <w:szCs w:val="24"/>
-        </w:rPr>
-        <w:t xml:space="preserve">Synofzik, M., Vosgerau, G., &amp; Newen, A. (2008). Beyond the comparator model: A multifactorial two-step account of agency. </w:t>
-      </w:r>
-      <w:r>
-        <w:rPr>
-          <w:rFonts w:ascii="Times New Roman" w:cs="Times New Roman" w:eastAsia="Times New Roman" w:hAnsi="Times New Roman"/>
-          <w:i/>
-          <w:iCs/>
-          <w:sz w:val="24"/>
-          <w:szCs w:val="24"/>
-        </w:rPr>
-        <w:t xml:space="preserve">Consciousness and Cognition, 17</w:t>
-      </w:r>
-      <w:r>
-        <w:rPr>
-          <w:rFonts w:ascii="Times New Roman" w:cs="Times New Roman" w:eastAsia="Times New Roman" w:hAnsi="Times New Roman"/>
-          <w:sz w:val="24"/>
-          <w:szCs w:val="24"/>
-        </w:rPr>
-        <w:t xml:space="preserve">(1), 219–239.</w:t>
-      </w:r>
-      <w:r>
-        <w:rPr>
-          <w:rFonts w:ascii="Times New Roman" w:cs="Times New Roman" w:eastAsia="Times New Roman" w:hAnsi="Times New Roman"/>
-          <w:color w:val="1A56DB"/>
-          <w:sz w:val="24"/>
-          <w:szCs w:val="24"/>
-          <w:u w:val="single"/>
-        </w:rPr>
         <w:t xml:space="preserve"> https://doi.org/10.1016/j.concog.2007.03.010</w:t>
-      </w:r>
-    </w:p>
-    <w:p>
-      <w:pPr>
-        <w:spacing w:after="120" w:before="0" w:line="480"/>
-        <w:ind w:left="720" w:hanging="720"/>
-      </w:pPr>
-      <w:r>
-        <w:rPr>
-          <w:rFonts w:ascii="Times New Roman" w:cs="Times New Roman" w:eastAsia="Times New Roman" w:hAnsi="Times New Roman"/>
-          <w:sz w:val="24"/>
-          <w:szCs w:val="24"/>
-        </w:rPr>
-        <w:t xml:space="preserve">Veenman, M. V. J., Van Hout-Wolters, B. H. A. M., &amp; Afflerbach, P. (2006). Metacognition and learning: Conceptual and methodological considerations. </w:t>
-      </w:r>
-      <w:r>
-        <w:rPr>
-          <w:rFonts w:ascii="Times New Roman" w:cs="Times New Roman" w:eastAsia="Times New Roman" w:hAnsi="Times New Roman"/>
-          <w:i/>
-          <w:iCs/>
-          <w:sz w:val="24"/>
-          <w:szCs w:val="24"/>
-        </w:rPr>
-        <w:t xml:space="preserve">Metacognition and Learning, 1</w:t>
-      </w:r>
-      <w:r>
-        <w:rPr>
-          <w:rFonts w:ascii="Times New Roman" w:cs="Times New Roman" w:eastAsia="Times New Roman" w:hAnsi="Times New Roman"/>
-          <w:sz w:val="24"/>
-          <w:szCs w:val="24"/>
-        </w:rPr>
-        <w:t xml:space="preserve">(1), 3–14.</w:t>
-      </w:r>
-      <w:r>
-        <w:rPr>
-          <w:rFonts w:ascii="Times New Roman" w:cs="Times New Roman" w:eastAsia="Times New Roman" w:hAnsi="Times New Roman"/>
-          <w:color w:val="1A56DB"/>
-          <w:sz w:val="24"/>
-          <w:szCs w:val="24"/>
-          <w:u w:val="single"/>
-        </w:rPr>
-        <w:t xml:space="preserve"> https://doi.org/10.1007/s11409-006-6893-0</w:t>
       </w:r>
     </w:p>
     <w:p>

</xml_diff>

<commit_message>
add equivalence test (tost) for melatonin null
</commit_message>
<xml_diff>
--- a/paper/Miura_Meng_Affect_Paper_v9.docx
+++ b/paper/Miura_Meng_Affect_Paper_v9.docx
@@ -99,7 +99,7 @@
           <w:sz w:val="24"/>
           <w:szCs w:val="24"/>
         </w:rPr>
-        <w:t>This study applies a control-theoretic framework to the intensive longitudinal self-study of affective dynamics in a single individual. The aim was to characterize how internal self-regulatory variables and an external pharmacological probe each shape daily mood. Over a 70-day protocol, momentary emotional valence, perceived agency, and metacognitive awareness were sampled three times daily via ecological momentary assessment (195 observations, 92.9% compliance). Nightly 3 mg melatonin administration was introduced according to a pre-generated randomized schedule. The pre-specified design yielded 35 control and 35 melatonin daily aggregates. The individual was modeled as a dynamical system; melatonin was treated as a probe to characterize the system’s response, not as a candidate treatment. Time-series methods (autoregressive, state-space, impulse response, heteroskedasticity, and metacontrol interaction analyses) were used to estimate the contributions of internal behavioral drivers and the external probe. Internal drivers (agency and metacognitive awareness) accounted for an additional 51.5% of daily-mood variance beyond autoregressive carryover and the melatonin probe (model R² rising from .125 to .641), while melatonin contributed negligibly to mean-level mood (Δ = +0.92 on a 0–100 scale, d = 0.17). A heteroskedasticity analysis suggested smaller residual variance on melatonin days, compatible with melatonin’s chronobiotic function. The metacontrol interaction was direction-consistent but underpowered. This case illustrates how internal self-regulatory variables and an external pharmacological probe contribute differentially to affective dynamics; the probe defined a sensitivity boundary rather than signaling absent effects.</w:t>
+        <w:t>This study applies a control-theoretic framework to the intensive longitudinal self-study of affective dynamics in a single individual. The aim was to characterize how internal self-regulatory variables and an external pharmacological probe each shape daily mood. Over a 70-day protocol, momentary emotional valence, perceived agency, and metacognitive awareness were sampled three times daily via ecological momentary assessment (195 observations, 92.9% compliance). Nightly 3 mg melatonin administration was introduced according to a pre-generated randomized schedule. The pre-specified design yielded 35 control and 35 melatonin daily aggregates. The individual was modeled as a dynamical system; melatonin was treated as a probe to characterize the system’s response, not as a candidate treatment. Time-series methods (autoregressive, state-space, impulse response, heteroskedasticity, and metacontrol interaction analyses) were used to estimate the contributions of internal behavioral drivers and the external probe. Internal drivers (agency and metacognitive awareness) accounted for an additional 51.5% of daily-mood variance beyond autoregressive carryover and the melatonin probe (model R² rising from .125 to .641), while melatonin contributed negligibly to mean-level mood (Δ = +0.92 on a 0–100 scale, d = 0.17; an equivalence test bounded this effect within ±5 points). A heteroskedasticity analysis suggested smaller residual variance on melatonin days, compatible with melatonin’s chronobiotic function. The metacontrol interaction was direction-consistent but underpowered. This case illustrates how internal self-regulatory variables and an external pharmacological probe contribute differentially to affective dynamics; the probe defined a sensitivity boundary rather than signaling absent effects.</w:t>
       </w:r>
     </w:p>
     <w:p>
@@ -1603,6 +1603,38 @@
           <w:szCs w:val="24"/>
         </w:rPr>
         <w:t xml:space="preserve">where i indexes the momentary observation within day j, u₀ⱼ ~ N(0, τ₀₀) is the day-level random intercept, and eᵢⱼ ~ N(0, σ²) is the within-day residual. The random intercept absorbs the between-day dependence that daily aggregation had otherwise handled by collapsing each day to its mean. Models were fit by restricted maximum likelihood in R 4.5 using lme4 (Bates, Mächler, Bolker, &amp; Walker, 2015), with Satterthwaite-approximated p-values from lmerTest (Kuznetsova, Brockhoff, &amp; Christensen, 2017). Between-day clustering was summarized by the intraclass correlation (ICC) from an unconditional model; variance explained was summarized by marginal R² (fixed effects only) and conditional R² (fixed effects plus random intercept). This analysis is restricted to the Day 18–70 window in which agency and metacognition were collected.</w:t>
+      </w:r>
+    </w:p>
+    <w:p>
+      <w:pPr>
+        <w:pStyle w:val="Heading3"/>
+        <w:spacing w:after="60" w:before="180" w:line="360"/>
+      </w:pPr>
+      <w:r>
+        <w:rPr>
+          <w:rFonts w:ascii="Times New Roman" w:cs="Times New Roman" w:eastAsia="Times New Roman" w:hAnsi="Times New Roman"/>
+          <w:b/>
+          <w:bCs/>
+          <w:i/>
+          <w:iCs/>
+          <w:sz w:val="24"/>
+          <w:szCs w:val="24"/>
+        </w:rPr>
+        <w:t xml:space="preserve">2.5.11 Equivalence test for the melatonin mean effect</w:t>
+      </w:r>
+    </w:p>
+    <w:p>
+      <w:pPr>
+        <w:spacing w:after="120" w:before="0" w:line="480"/>
+        <w:jc w:val="both"/>
+      </w:pPr>
+      <w:r>
+        <w:rPr>
+          <w:rFonts w:ascii="Times New Roman" w:cs="Times New Roman" w:eastAsia="Times New Roman" w:hAnsi="Times New Roman"/>
+          <w:sz w:val="24"/>
+          <w:szCs w:val="24"/>
+        </w:rPr>
+        <w:t xml:space="preserve">Because a non-significant mean difference does not by itself establish the absence of a meaningful effect, the melatonin mean effect was also evaluated with a two one-sided tests (TOST) equivalence procedure (Lakens, 2017). A smallest effect size of interest (SESOI) of ±5 points on the 0–100 mood scale was specified as the smallest day-level mean shift judged practically meaningful for this individual, approximately 0.9 of the daily mood standard deviation. The TOST evaluates whether the observed effect is statistically closer to zero than to either equivalence bound, which is equivalent to testing whether the 90% confidence interval of the mean difference falls entirely within the bounds. A tighter ±3-point bound is reported alongside for comparison.</w:t>
       </w:r>
     </w:p>
     <w:p>
@@ -4534,7 +4566,7 @@
           <w:sz w:val="24"/>
           <w:szCs w:val="24"/>
         </w:rPr>
-        <w:t>Consistent with the M1 result above, the between-condition comparison of daily mean mood yielded a small and non-significant difference: melatonin minus control = +0.92 mood points, Welch t(60.6) = 0.70, p = .489, Cohen's d = 0.17 (Figure 7). Within the framing developed in Section 1.2, this null on the mean is interpreted as identifying the system's sensitivity boundary on the level dimension of mood: a probe of this magnitude does not detectably shift the mean.</w:t>
+        <w:t>Consistent with the M1 result above, the between-condition comparison of daily mean mood yielded a small and non-significant difference: melatonin minus control = +0.92 mood points, Welch t(60.6) = 0.70, p = .489, Cohen's d = 0.17 (Figure 7). A two one-sided tests (TOST) equivalence procedure sharpened this null: the 90% confidence interval for the mean difference, [−1.29, +3.12] points, fell within the pre-specified ±5-point bound, establishing equivalence at that bound (TOST p = .002), so effects larger than about 5 points (d ≈ 0.9) can be rejected; at a tighter ±3-point bound the interval was not fully contained and equivalence was not established (TOST p = .060). The data therefore bound the melatonin mean effect to at most roughly +3 points on the high side. Within the framing developed in Section 1.2, this null on the mean is interpreted as identifying the system's sensitivity boundary on the level dimension of mood: a probe of this magnitude does not detectably shift the mean.</w:t>
       </w:r>
     </w:p>
     <w:p>
@@ -7124,7 +7156,7 @@
           <w:sz w:val="24"/>
           <w:szCs w:val="24"/>
         </w:rPr>
-        <w:t>The conclusion is constrained in two ways that should be made explicit. The 95% confidence interval on the M2 melatonin coefficient does not exclude small effects in either direction, and the present sample contains 53 days of full-model data and cannot rule out a small mean shift that would be detectable at higher power. The interpretation offered here is therefore not “melatonin has no effect on this person’s mood” but “melatonin’s contribution to this person’s daily mood, in the presence of measured internal drivers, is functionally negligible relative to those drivers.”</w:t>
+        <w:t>The conclusion is constrained in two ways that should be made explicit. The 95% confidence interval on the M2 melatonin coefficient does not exclude small effects in either direction, and the present sample contains 53 days of full-model data and cannot rule out a small mean shift that would be detectable at higher power. A two one-sided tests procedure quantified this bound directly: the 90% confidence interval for the raw mean difference fell within ±5 points (equivalence at that bound, p = .002) but not within ±3 points (p = .060), bounding the effect at roughly 3 to 5 points even though smaller effects cannot be excluded. The interpretation offered here is therefore not “melatonin has no effect on this person’s mood” but “melatonin’s contribution to this person’s daily mood, in the presence of measured internal drivers, is functionally negligible relative to those drivers.”</w:t>
       </w:r>
     </w:p>
     <w:p>

</xml_diff>